<commit_message>
version 2 of AI_lab added
</commit_message>
<xml_diff>
--- a/AI_Lab_Docs.docx
+++ b/AI_Lab_Docs.docx
@@ -14,7 +14,14 @@
           <w:b/>
           <w:bCs/>
         </w:rPr>
-        <w:t>Part 1 – Prototype System Capabilities</w:t>
+        <w:t>Prototype System Capabilities</w:t>
+      </w:r>
+      <w:r>
+        <w:rPr>
+          <w:b/>
+          <w:bCs/>
+        </w:rPr>
+        <w:t xml:space="preserve"> – GPU Based</w:t>
       </w:r>
     </w:p>
     <w:p>
@@ -37,23 +44,7 @@
     </w:p>
     <w:p>
       <w:r>
-        <w:t>This setup is optimized for local inference, fine-tuning parameter-efficient adapters (</w:t>
-      </w:r>
-      <w:proofErr w:type="spellStart"/>
-      <w:r>
-        <w:t>LoRA</w:t>
-      </w:r>
-      <w:proofErr w:type="spellEnd"/>
-      <w:r>
-        <w:t>/</w:t>
-      </w:r>
-      <w:proofErr w:type="spellStart"/>
-      <w:r>
-        <w:t>QLoRA</w:t>
-      </w:r>
-      <w:proofErr w:type="spellEnd"/>
-      <w:r>
-        <w:t>), and secure Retrieval-Augmented Generation (RAG).</w:t>
+        <w:t>This setup is optimized for local inference, fine-tuning parameter-efficient adapters (LoRA/QLoRA), and secure Retrieval-Augmented Generation (RAG).</w:t>
       </w:r>
     </w:p>
     <w:p/>
@@ -78,7 +69,7 @@
                     <pic:cNvPicPr/>
                   </pic:nvPicPr>
                   <pic:blipFill>
-                    <a:blip r:embed="rId5"/>
+                    <a:blip r:embed="rId7"/>
                     <a:stretch>
                       <a:fillRect/>
                     </a:stretch>
@@ -222,15 +213,7 @@
         <w:t>Concurrent Throughput:</w:t>
       </w:r>
       <w:r>
-        <w:t xml:space="preserve"> Using continuous batching engines (such as </w:t>
-      </w:r>
-      <w:proofErr w:type="spellStart"/>
-      <w:r>
-        <w:t>vLLM</w:t>
-      </w:r>
-      <w:proofErr w:type="spellEnd"/>
-      <w:r>
-        <w:t xml:space="preserve">), the workstation comfortably supports </w:t>
+        <w:t xml:space="preserve"> Using continuous batching engines (such as vLLM), the workstation comfortably supports </w:t>
       </w:r>
       <w:r>
         <w:rPr>
@@ -301,15 +284,7 @@
         <w:t>Training from Scratch:</w:t>
       </w:r>
       <w:r>
-        <w:t xml:space="preserve"> The prototype cannot train foundational base models from zero (this requires multi-million-dollar clusters). It is built for inference, RAG, and lightweight fine-tuning (</w:t>
-      </w:r>
-      <w:proofErr w:type="spellStart"/>
-      <w:r>
-        <w:t>LoRA</w:t>
-      </w:r>
-      <w:proofErr w:type="spellEnd"/>
-      <w:r>
-        <w:t>).</w:t>
+        <w:t xml:space="preserve"> The prototype cannot train foundational base models from zero (this requires multi-million-dollar clusters). It is built for inference, RAG, and lightweight fine-tuning (LoRA).</w:t>
       </w:r>
     </w:p>
     <w:p>
@@ -345,15 +320,7 @@
         <w:t>Mass Multi-Modal Video Analytics:</w:t>
       </w:r>
       <w:r>
-        <w:t xml:space="preserve"> It cannot </w:t>
-      </w:r>
-      <w:proofErr w:type="spellStart"/>
-      <w:r>
-        <w:t>analyze</w:t>
-      </w:r>
-      <w:proofErr w:type="spellEnd"/>
-      <w:r>
-        <w:t xml:space="preserve"> live video feeds from hundreds of ATM cameras simultaneously.</w:t>
+        <w:t xml:space="preserve"> It cannot analyze live video feeds from hundreds of ATM cameras simultaneously.</w:t>
       </w:r>
     </w:p>
     <w:p/>
@@ -369,23 +336,7 @@
           <w:b/>
           <w:bCs/>
         </w:rPr>
-        <w:t xml:space="preserve">Part 2 – </w:t>
-      </w:r>
-      <w:proofErr w:type="gramStart"/>
-      <w:r>
-        <w:rPr>
-          <w:b/>
-          <w:bCs/>
-        </w:rPr>
-        <w:t>10 month</w:t>
-      </w:r>
-      <w:proofErr w:type="gramEnd"/>
-      <w:r>
-        <w:rPr>
-          <w:b/>
-          <w:bCs/>
-        </w:rPr>
-        <w:t xml:space="preserve"> Implementation Roadmap</w:t>
+        <w:t>Part 2 – 10 month Implementation Roadmap</w:t>
       </w:r>
     </w:p>
     <w:p>
@@ -1077,15 +1028,7 @@
     <w:p/>
     <w:p>
       <w:r>
-        <w:t xml:space="preserve">Detailed </w:t>
-      </w:r>
-      <w:proofErr w:type="gramStart"/>
-      <w:r>
-        <w:t>Breakdown :</w:t>
-      </w:r>
-      <w:proofErr w:type="gramEnd"/>
-      <w:r>
-        <w:t xml:space="preserve"> </w:t>
+        <w:t xml:space="preserve">Detailed Breakdown : </w:t>
       </w:r>
     </w:p>
     <w:p>
@@ -1174,15 +1117,7 @@
         </w:numPr>
       </w:pPr>
       <w:r>
-        <w:t xml:space="preserve">Assemble hardware, install Ubuntu 24.04 LTS Server, and configure RAID-1 on </w:t>
-      </w:r>
-      <w:proofErr w:type="spellStart"/>
-      <w:r>
-        <w:t>NVMe</w:t>
-      </w:r>
-      <w:proofErr w:type="spellEnd"/>
-      <w:r>
-        <w:t xml:space="preserve"> storage.</w:t>
+        <w:t>Assemble hardware, install Ubuntu 24.04 LTS Server, and configure RAID-1 on NVMe storage.</w:t>
       </w:r>
     </w:p>
     <w:p>
@@ -1247,7 +1182,6 @@
       <w:r>
         <w:t xml:space="preserve">Install containerized environments via Docker, deploying </w:t>
       </w:r>
-      <w:proofErr w:type="spellStart"/>
       <w:r>
         <w:rPr>
           <w:b/>
@@ -1255,11 +1189,9 @@
         </w:rPr>
         <w:t>vLLM</w:t>
       </w:r>
-      <w:proofErr w:type="spellEnd"/>
       <w:r>
         <w:t xml:space="preserve"> and </w:t>
       </w:r>
-      <w:proofErr w:type="spellStart"/>
       <w:r>
         <w:rPr>
           <w:b/>
@@ -1267,7 +1199,6 @@
         </w:rPr>
         <w:t>Ollama</w:t>
       </w:r>
-      <w:proofErr w:type="spellEnd"/>
       <w:r>
         <w:t>.</w:t>
       </w:r>
@@ -1314,17 +1245,8 @@
           <w:b/>
           <w:bCs/>
         </w:rPr>
-        <w:t xml:space="preserve">Open </w:t>
-      </w:r>
-      <w:proofErr w:type="spellStart"/>
-      <w:r>
-        <w:rPr>
-          <w:b/>
-          <w:bCs/>
-        </w:rPr>
-        <w:t>WebUI</w:t>
-      </w:r>
-      <w:proofErr w:type="spellEnd"/>
+        <w:t>Open WebUI</w:t>
+      </w:r>
       <w:r>
         <w:t xml:space="preserve"> behind the bank's Active Directory/LDAP single sign-on (SSO).</w:t>
       </w:r>
@@ -1391,7 +1313,6 @@
       <w:r>
         <w:t>Deploy an on-premise vector store (</w:t>
       </w:r>
-      <w:proofErr w:type="spellStart"/>
       <w:r>
         <w:rPr>
           <w:b/>
@@ -1399,11 +1320,9 @@
         </w:rPr>
         <w:t>ChromaDB</w:t>
       </w:r>
-      <w:proofErr w:type="spellEnd"/>
       <w:r>
         <w:t xml:space="preserve"> or </w:t>
       </w:r>
-      <w:proofErr w:type="spellStart"/>
       <w:r>
         <w:rPr>
           <w:b/>
@@ -1411,7 +1330,6 @@
         </w:rPr>
         <w:t>Qdrant</w:t>
       </w:r>
-      <w:proofErr w:type="spellEnd"/>
       <w:r>
         <w:t>).</w:t>
       </w:r>
@@ -1678,23 +1596,7 @@
           <w:b/>
           <w:bCs/>
         </w:rPr>
-        <w:t xml:space="preserve">Part 3: </w:t>
-      </w:r>
-      <w:proofErr w:type="spellStart"/>
-      <w:r>
-        <w:rPr>
-          <w:b/>
-          <w:bCs/>
-        </w:rPr>
-        <w:t>CapEx</w:t>
-      </w:r>
-      <w:proofErr w:type="spellEnd"/>
-      <w:r>
-        <w:rPr>
-          <w:b/>
-          <w:bCs/>
-        </w:rPr>
-        <w:t xml:space="preserve"> Budget Breakdown (Within ₹10 Lakhs)</w:t>
+        <w:t>Part 3: CapEx Budget Breakdown (Within ₹10 Lakhs)</w:t>
       </w:r>
     </w:p>
     <w:tbl>
@@ -1944,23 +1846,7 @@
           </w:tcPr>
           <w:p>
             <w:r>
-              <w:t xml:space="preserve">AMD </w:t>
-            </w:r>
-            <w:proofErr w:type="spellStart"/>
-            <w:r>
-              <w:t>Ryzen</w:t>
-            </w:r>
-            <w:proofErr w:type="spellEnd"/>
-            <w:r>
-              <w:t xml:space="preserve"> </w:t>
-            </w:r>
-            <w:proofErr w:type="spellStart"/>
-            <w:r>
-              <w:t>Threadripper</w:t>
-            </w:r>
-            <w:proofErr w:type="spellEnd"/>
-            <w:r>
-              <w:t xml:space="preserve"> 7960X (24-Cores, 48-Threads, high PCIe lanes)</w:t>
+              <w:t>AMD Ryzen Threadripper 7960X (24-Cores, 48-Threads, high PCIe lanes)</w:t>
             </w:r>
           </w:p>
         </w:tc>
@@ -2203,15 +2089,7 @@
           </w:tcPr>
           <w:p>
             <w:r>
-              <w:t xml:space="preserve">2x 2TB Enterprise M.2 </w:t>
-            </w:r>
-            <w:proofErr w:type="spellStart"/>
-            <w:r>
-              <w:t>NVMe</w:t>
-            </w:r>
-            <w:proofErr w:type="spellEnd"/>
-            <w:r>
-              <w:t xml:space="preserve"> Gen 4 SSDs (RAID-1 configuration)</w:t>
+              <w:t>2x 2TB Enterprise M.2 NVMe Gen 4 SSDs (RAID-1 configuration)</w:t>
             </w:r>
           </w:p>
         </w:tc>
@@ -2674,17 +2552,8 @@
                 <w:b/>
                 <w:bCs/>
               </w:rPr>
-              <w:t xml:space="preserve">Total Project </w:t>
+              <w:t>Total Project CapEx</w:t>
             </w:r>
-            <w:proofErr w:type="spellStart"/>
-            <w:r>
-              <w:rPr>
-                <w:b/>
-                <w:bCs/>
-              </w:rPr>
-              <w:t>CapEx</w:t>
-            </w:r>
-            <w:proofErr w:type="spellEnd"/>
           </w:p>
         </w:tc>
         <w:tc>
@@ -2866,7 +2735,7 @@
     </w:p>
     <w:p>
       <w:r>
-        <w:t xml:space="preserve">Instead of running models at standard 16-bit precision, your team will use </w:t>
+        <w:t xml:space="preserve">Instead of running models at standard 16-bit precision, our team will use </w:t>
       </w:r>
       <w:r>
         <w:rPr>
@@ -2885,44 +2754,12 @@
           <w:b/>
           <w:bCs/>
         </w:rPr>
-        <w:t>2. Capping the Context Window (</w:t>
-      </w:r>
-      <w:proofErr w:type="spellStart"/>
-      <w:r>
-        <w:rPr>
-          <w:b/>
-          <w:bCs/>
-        </w:rPr>
-        <w:t>max_model_len</w:t>
-      </w:r>
-      <w:proofErr w:type="spellEnd"/>
-      <w:r>
-        <w:rPr>
-          <w:b/>
-          <w:bCs/>
-        </w:rPr>
-        <w:t>)</w:t>
-      </w:r>
-    </w:p>
-    <w:p>
-      <w:r>
-        <w:t xml:space="preserve">Engineers must manually limit the model's context window. Even if Llama 3 can handle 128k tokens, the engineers will configure the </w:t>
-      </w:r>
-      <w:proofErr w:type="spellStart"/>
-      <w:r>
-        <w:t>vLLM</w:t>
-      </w:r>
-      <w:proofErr w:type="spellEnd"/>
-      <w:r>
-        <w:t xml:space="preserve"> engine with a strict --max-model-</w:t>
-      </w:r>
-      <w:proofErr w:type="spellStart"/>
-      <w:r>
-        <w:t>len</w:t>
-      </w:r>
-      <w:proofErr w:type="spellEnd"/>
-      <w:r>
-        <w:t xml:space="preserve"> 8192 (about 25 pages of text). This stops any single employee from pasting an entire codebase and accidentally crashing the server for everyone else.</w:t>
+        <w:t>2. Capping the Context Window (max_model_len)</w:t>
+      </w:r>
+    </w:p>
+    <w:p>
+      <w:r>
+        <w:t>Engineers must manually limit the model's context window. Even if Llama 3 can handle 128k tokens, the engineers will configure the vLLM engine with a strict --max-model-len 8192 (about 25 pages of text). This stops any single employee from pasting an entire codebase and accidentally crashing the server for everyone else.</w:t>
       </w:r>
     </w:p>
     <w:p>
@@ -2936,15 +2773,7 @@
     </w:p>
     <w:p>
       <w:r>
-        <w:t xml:space="preserve">Newer inference engines allow you to compress the KV cache itself. By quantizing the KV cache down to 8-bit, the server can instantly handle double the </w:t>
-      </w:r>
-      <w:proofErr w:type="gramStart"/>
-      <w:r>
-        <w:t>amount</w:t>
-      </w:r>
-      <w:proofErr w:type="gramEnd"/>
-      <w:r>
-        <w:t xml:space="preserve"> of concurrent users with virtually zero loss in answer quality. </w:t>
+        <w:t xml:space="preserve">Newer inference engines allow you to compress the KV cache itself. By quantizing the KV cache down to 8-bit, the server can instantly handle double the amount of concurrent users with virtually zero loss in answer quality. </w:t>
       </w:r>
     </w:p>
     <w:p>
@@ -3201,15 +3030,7 @@
         <w:t>Qwen 3.6 (27B or 35B-MoE):</w:t>
       </w:r>
       <w:r>
-        <w:t xml:space="preserve"> The Qwen 3.6 architecture is currently dominating the mid-weight tier. The 35B Mixture-of-Experts (</w:t>
-      </w:r>
-      <w:proofErr w:type="spellStart"/>
-      <w:r>
-        <w:t>MoE</w:t>
-      </w:r>
-      <w:proofErr w:type="spellEnd"/>
-      <w:r>
-        <w:t>) variant is incredibly efficient—it only activates a small subset of its "expert" neural networks at a time. This gives you the reasoning power of a massive model while consuming far less VRAM and generating answers incredibly fast. It is exceptional at multilingual tasks and reading complex structured data (like JSON or banking CSVs).</w:t>
+        <w:t xml:space="preserve"> The Qwen 3.6 architecture is currently dominating the mid-weight tier. The 35B Mixture-of-Experts (MoE) variant is incredibly efficient—it only activates a small subset of its "expert" neural networks at a time. This gives you the reasoning power of a massive model while consuming far less VRAM and generating answers incredibly fast. It is exceptional at multilingual tasks and reading complex structured data (like JSON or banking CSVs).</w:t>
       </w:r>
     </w:p>
     <w:p>
@@ -3329,34 +3150,10 @@
           <w:b/>
           <w:bCs/>
         </w:rPr>
-        <w:t xml:space="preserve">Cross-Encoder / </w:t>
-      </w:r>
-      <w:proofErr w:type="spellStart"/>
-      <w:r>
-        <w:rPr>
-          <w:b/>
-          <w:bCs/>
-        </w:rPr>
-        <w:t>Reranker</w:t>
-      </w:r>
-      <w:proofErr w:type="spellEnd"/>
-      <w:r>
-        <w:rPr>
-          <w:b/>
-          <w:bCs/>
-        </w:rPr>
-        <w:t xml:space="preserve"> (e.g., BGE-Reranker-v2/v3):</w:t>
-      </w:r>
-      <w:r>
-        <w:t xml:space="preserve"> When a user searches the vector database, it might return 10 possible policy paragraphs. A </w:t>
-      </w:r>
-      <w:proofErr w:type="spellStart"/>
-      <w:r>
-        <w:t>reranker</w:t>
-      </w:r>
-      <w:proofErr w:type="spellEnd"/>
-      <w:r>
-        <w:t xml:space="preserve"> model acts as a "judge," re-reading those 10 paragraphs and ensuring only the most strictly accurate, legally relevant text is fed to the chat model.</w:t>
+        <w:t>Cross-Encoder / Reranker (e.g., BGE-Reranker-v2/v3):</w:t>
+      </w:r>
+      <w:r>
+        <w:t xml:space="preserve"> When a user searches the vector database, it might return 10 possible policy paragraphs. A reranker model acts as a "judge," re-reading those 10 paragraphs and ensuring only the most strictly accurate, legally relevant text is fed to the chat model.</w:t>
       </w:r>
     </w:p>
     <w:p>
@@ -3411,17 +3208,8 @@
           <w:b/>
           <w:bCs/>
         </w:rPr>
-        <w:t>BGE-</w:t>
-      </w:r>
-      <w:proofErr w:type="spellStart"/>
-      <w:r>
-        <w:rPr>
-          <w:b/>
-          <w:bCs/>
-        </w:rPr>
-        <w:t>Reranker</w:t>
-      </w:r>
-      <w:proofErr w:type="spellEnd"/>
+        <w:t>BGE-Reranker</w:t>
+      </w:r>
       <w:r>
         <w:t xml:space="preserve"> to handle concurrent policy searches and compliance Q&amp;A from bank staff.</w:t>
       </w:r>
@@ -3487,85 +3275,2302 @@
       </w:pPr>
       <w:r>
         <w:lastRenderedPageBreak/>
-        <w:t xml:space="preserve">Similar </w:t>
+        <w:t xml:space="preserve">Similar Implementations : </w:t>
+      </w:r>
+      <w:r>
+        <w:br/>
+      </w:r>
+    </w:p>
+    <w:p>
+      <w:pPr>
+        <w:rPr>
+          <w:b/>
+          <w:bCs/>
+        </w:rPr>
+      </w:pPr>
+      <w:r>
+        <w:rPr>
+          <w:b/>
+          <w:bCs/>
+        </w:rPr>
+        <w:t>SBI Life Insurance</w:t>
+      </w:r>
+    </w:p>
+    <w:p>
+      <w:r>
+        <w:t xml:space="preserve">Within the State Bank of India ecosystem, SBI Life deployed an internal platform called "InsightGenie". This is an AI-driven data insights platform explicitly built as a secure, on-premise solution. It allows their internal teams to access, analyze, and query multi-layered proprietary performance data without exposing that financial telemetry to external cloud networks. </w:t>
+      </w:r>
+    </w:p>
+    <w:p/>
+    <w:p>
+      <w:pPr>
+        <w:rPr>
+          <w:b/>
+          <w:bCs/>
+        </w:rPr>
+      </w:pPr>
+      <w:r>
+        <w:rPr>
+          <w:b/>
+          <w:bCs/>
+        </w:rPr>
+        <w:t>MUFG (Mitsubishi UFJ Financial Group)</w:t>
+      </w:r>
+    </w:p>
+    <w:p>
+      <w:r>
+        <w:t>MUFG has deployed on-premise, air-gapped AI workflows specifically designed for core banking compliance. By using localized platforms, they can run deterministic AI tasks—like KYC document processing, AML (Anti-Money Laundering) checks, and loan underwriting automation—ensuring that highly sensitive customer identification data never leaves the bank's controlled infrastructure.</w:t>
+      </w:r>
+    </w:p>
+    <w:p/>
+    <w:p/>
+    <w:p/>
+    <w:p/>
+    <w:p/>
+    <w:p/>
+    <w:p/>
+    <w:p/>
+    <w:p/>
+    <w:p/>
+    <w:p/>
+    <w:p/>
+    <w:p/>
+    <w:p/>
+    <w:p/>
+    <w:p/>
+    <w:p>
+      <w:pPr>
+        <w:rPr>
+          <w:b/>
+          <w:bCs/>
+        </w:rPr>
+      </w:pPr>
+      <w:r>
+        <w:rPr>
+          <w:b/>
+          <w:bCs/>
+        </w:rPr>
+        <w:lastRenderedPageBreak/>
+        <w:t>CPU Based</w:t>
+      </w:r>
+    </w:p>
+    <w:p>
+      <w:pPr>
+        <w:rPr>
+          <w:b/>
+          <w:bCs/>
+        </w:rPr>
+      </w:pPr>
+      <w:r>
+        <w:rPr>
+          <w:b/>
+          <w:bCs/>
+        </w:rPr>
+        <w:t>Bill of Materials (BOM): The CPU-Only AI Workstation</w:t>
+      </w:r>
+    </w:p>
+    <w:tbl>
+      <w:tblPr>
+        <w:tblW w:w="0" w:type="auto"/>
+        <w:tblCellSpacing w:w="15" w:type="dxa"/>
+        <w:tblCellMar>
+          <w:top w:w="15" w:type="dxa"/>
+          <w:left w:w="15" w:type="dxa"/>
+          <w:bottom w:w="15" w:type="dxa"/>
+          <w:right w:w="15" w:type="dxa"/>
+        </w:tblCellMar>
+        <w:tblLook w:val="04A0" w:firstRow="1" w:lastRow="0" w:firstColumn="1" w:lastColumn="0" w:noHBand="0" w:noVBand="1"/>
+      </w:tblPr>
+      <w:tblGrid>
+        <w:gridCol w:w="2172"/>
+        <w:gridCol w:w="5219"/>
+        <w:gridCol w:w="1619"/>
+      </w:tblGrid>
+      <w:tr>
+        <w:trPr>
+          <w:tblHeader/>
+          <w:tblCellSpacing w:w="15" w:type="dxa"/>
+        </w:trPr>
+        <w:tc>
+          <w:tcPr>
+            <w:tcW w:w="0" w:type="auto"/>
+            <w:tcBorders>
+              <w:top w:val="single" w:sz="6" w:space="0" w:color="C4C7C5"/>
+              <w:left w:val="single" w:sz="6" w:space="0" w:color="C4C7C5"/>
+              <w:bottom w:val="single" w:sz="6" w:space="0" w:color="C4C7C5"/>
+              <w:right w:val="single" w:sz="6" w:space="0" w:color="C4C7C5"/>
+            </w:tcBorders>
+            <w:tcMar>
+              <w:top w:w="120" w:type="dxa"/>
+              <w:left w:w="180" w:type="dxa"/>
+              <w:bottom w:w="120" w:type="dxa"/>
+              <w:right w:w="180" w:type="dxa"/>
+            </w:tcMar>
+            <w:vAlign w:val="center"/>
+            <w:hideMark/>
+          </w:tcPr>
+          <w:p>
+            <w:r>
+              <w:rPr>
+                <w:b/>
+                <w:bCs/>
+              </w:rPr>
+              <w:t>Category</w:t>
+            </w:r>
+          </w:p>
+        </w:tc>
+        <w:tc>
+          <w:tcPr>
+            <w:tcW w:w="0" w:type="auto"/>
+            <w:tcBorders>
+              <w:top w:val="single" w:sz="6" w:space="0" w:color="C4C7C5"/>
+              <w:left w:val="single" w:sz="6" w:space="0" w:color="C4C7C5"/>
+              <w:bottom w:val="single" w:sz="6" w:space="0" w:color="C4C7C5"/>
+              <w:right w:val="single" w:sz="6" w:space="0" w:color="C4C7C5"/>
+            </w:tcBorders>
+            <w:tcMar>
+              <w:top w:w="120" w:type="dxa"/>
+              <w:left w:w="180" w:type="dxa"/>
+              <w:bottom w:w="120" w:type="dxa"/>
+              <w:right w:w="180" w:type="dxa"/>
+            </w:tcMar>
+            <w:vAlign w:val="center"/>
+            <w:hideMark/>
+          </w:tcPr>
+          <w:p>
+            <w:r>
+              <w:rPr>
+                <w:b/>
+                <w:bCs/>
+              </w:rPr>
+              <w:t>Component Details</w:t>
+            </w:r>
+          </w:p>
+        </w:tc>
+        <w:tc>
+          <w:tcPr>
+            <w:tcW w:w="0" w:type="auto"/>
+            <w:tcBorders>
+              <w:top w:val="single" w:sz="6" w:space="0" w:color="C4C7C5"/>
+              <w:left w:val="single" w:sz="6" w:space="0" w:color="C4C7C5"/>
+              <w:bottom w:val="single" w:sz="6" w:space="0" w:color="C4C7C5"/>
+              <w:right w:val="single" w:sz="6" w:space="0" w:color="C4C7C5"/>
+            </w:tcBorders>
+            <w:tcMar>
+              <w:top w:w="120" w:type="dxa"/>
+              <w:left w:w="180" w:type="dxa"/>
+              <w:bottom w:w="120" w:type="dxa"/>
+              <w:right w:w="180" w:type="dxa"/>
+            </w:tcMar>
+            <w:vAlign w:val="center"/>
+            <w:hideMark/>
+          </w:tcPr>
+          <w:p>
+            <w:r>
+              <w:rPr>
+                <w:b/>
+                <w:bCs/>
+              </w:rPr>
+              <w:t>Estimated Cost (INR)</w:t>
+            </w:r>
+          </w:p>
+        </w:tc>
+      </w:tr>
+      <w:tr>
+        <w:trPr>
+          <w:tblCellSpacing w:w="15" w:type="dxa"/>
+        </w:trPr>
+        <w:tc>
+          <w:tcPr>
+            <w:tcW w:w="0" w:type="auto"/>
+            <w:tcBorders>
+              <w:top w:val="single" w:sz="6" w:space="0" w:color="C4C7C5"/>
+              <w:left w:val="single" w:sz="6" w:space="0" w:color="C4C7C5"/>
+              <w:bottom w:val="single" w:sz="6" w:space="0" w:color="C4C7C5"/>
+              <w:right w:val="single" w:sz="6" w:space="0" w:color="C4C7C5"/>
+            </w:tcBorders>
+            <w:tcMar>
+              <w:top w:w="120" w:type="dxa"/>
+              <w:left w:w="180" w:type="dxa"/>
+              <w:bottom w:w="120" w:type="dxa"/>
+              <w:right w:w="180" w:type="dxa"/>
+            </w:tcMar>
+            <w:vAlign w:val="center"/>
+            <w:hideMark/>
+          </w:tcPr>
+          <w:p>
+            <w:r>
+              <w:rPr>
+                <w:b/>
+                <w:bCs/>
+              </w:rPr>
+              <w:t>CPU (The Engine)</w:t>
+            </w:r>
+          </w:p>
+        </w:tc>
+        <w:tc>
+          <w:tcPr>
+            <w:tcW w:w="0" w:type="auto"/>
+            <w:tcBorders>
+              <w:top w:val="single" w:sz="6" w:space="0" w:color="C4C7C5"/>
+              <w:left w:val="single" w:sz="6" w:space="0" w:color="C4C7C5"/>
+              <w:bottom w:val="single" w:sz="6" w:space="0" w:color="C4C7C5"/>
+              <w:right w:val="single" w:sz="6" w:space="0" w:color="C4C7C5"/>
+            </w:tcBorders>
+            <w:tcMar>
+              <w:top w:w="120" w:type="dxa"/>
+              <w:left w:w="180" w:type="dxa"/>
+              <w:bottom w:w="120" w:type="dxa"/>
+              <w:right w:w="180" w:type="dxa"/>
+            </w:tcMar>
+            <w:vAlign w:val="center"/>
+            <w:hideMark/>
+          </w:tcPr>
+          <w:p>
+            <w:r>
+              <w:rPr>
+                <w:b/>
+                <w:bCs/>
+              </w:rPr>
+              <w:t xml:space="preserve">AMD </w:t>
+            </w:r>
+            <w:proofErr w:type="spellStart"/>
+            <w:r>
+              <w:rPr>
+                <w:b/>
+                <w:bCs/>
+              </w:rPr>
+              <w:t>Ryzen</w:t>
+            </w:r>
+            <w:proofErr w:type="spellEnd"/>
+            <w:r>
+              <w:rPr>
+                <w:b/>
+                <w:bCs/>
+              </w:rPr>
+              <w:t xml:space="preserve"> </w:t>
+            </w:r>
+            <w:proofErr w:type="spellStart"/>
+            <w:r>
+              <w:rPr>
+                <w:b/>
+                <w:bCs/>
+              </w:rPr>
+              <w:t>Threadripper</w:t>
+            </w:r>
+            <w:proofErr w:type="spellEnd"/>
+            <w:r>
+              <w:rPr>
+                <w:b/>
+                <w:bCs/>
+              </w:rPr>
+              <w:t xml:space="preserve"> PRO 7955WX (16-Core/32-Thread)</w:t>
+            </w:r>
+            <w:r>
+              <w:t xml:space="preserve">. </w:t>
+            </w:r>
+            <w:r>
+              <w:rPr>
+                <w:i/>
+                <w:iCs/>
+              </w:rPr>
+              <w:t>Why?</w:t>
+            </w:r>
+            <w:r>
+              <w:t xml:space="preserve"> It supports 8-channel DDR5 memory, which is critical for pushing data to the CPU cores fast enough to maintain readable inference speeds.</w:t>
+            </w:r>
+          </w:p>
+        </w:tc>
+        <w:tc>
+          <w:tcPr>
+            <w:tcW w:w="0" w:type="auto"/>
+            <w:tcBorders>
+              <w:top w:val="single" w:sz="6" w:space="0" w:color="C4C7C5"/>
+              <w:left w:val="single" w:sz="6" w:space="0" w:color="C4C7C5"/>
+              <w:bottom w:val="single" w:sz="6" w:space="0" w:color="C4C7C5"/>
+              <w:right w:val="single" w:sz="6" w:space="0" w:color="C4C7C5"/>
+            </w:tcBorders>
+            <w:tcMar>
+              <w:top w:w="120" w:type="dxa"/>
+              <w:left w:w="180" w:type="dxa"/>
+              <w:bottom w:w="120" w:type="dxa"/>
+              <w:right w:w="180" w:type="dxa"/>
+            </w:tcMar>
+            <w:vAlign w:val="center"/>
+            <w:hideMark/>
+          </w:tcPr>
+          <w:p>
+            <w:r>
+              <w:t>₹ 2,30,000</w:t>
+            </w:r>
+          </w:p>
+        </w:tc>
+      </w:tr>
+      <w:tr>
+        <w:trPr>
+          <w:tblCellSpacing w:w="15" w:type="dxa"/>
+        </w:trPr>
+        <w:tc>
+          <w:tcPr>
+            <w:tcW w:w="0" w:type="auto"/>
+            <w:tcBorders>
+              <w:top w:val="single" w:sz="6" w:space="0" w:color="C4C7C5"/>
+              <w:left w:val="single" w:sz="6" w:space="0" w:color="C4C7C5"/>
+              <w:bottom w:val="single" w:sz="6" w:space="0" w:color="C4C7C5"/>
+              <w:right w:val="single" w:sz="6" w:space="0" w:color="C4C7C5"/>
+            </w:tcBorders>
+            <w:tcMar>
+              <w:top w:w="120" w:type="dxa"/>
+              <w:left w:w="180" w:type="dxa"/>
+              <w:bottom w:w="120" w:type="dxa"/>
+              <w:right w:w="180" w:type="dxa"/>
+            </w:tcMar>
+            <w:vAlign w:val="center"/>
+            <w:hideMark/>
+          </w:tcPr>
+          <w:p>
+            <w:r>
+              <w:rPr>
+                <w:b/>
+                <w:bCs/>
+              </w:rPr>
+              <w:t>Motherboard</w:t>
+            </w:r>
+          </w:p>
+        </w:tc>
+        <w:tc>
+          <w:tcPr>
+            <w:tcW w:w="0" w:type="auto"/>
+            <w:tcBorders>
+              <w:top w:val="single" w:sz="6" w:space="0" w:color="C4C7C5"/>
+              <w:left w:val="single" w:sz="6" w:space="0" w:color="C4C7C5"/>
+              <w:bottom w:val="single" w:sz="6" w:space="0" w:color="C4C7C5"/>
+              <w:right w:val="single" w:sz="6" w:space="0" w:color="C4C7C5"/>
+            </w:tcBorders>
+            <w:tcMar>
+              <w:top w:w="120" w:type="dxa"/>
+              <w:left w:w="180" w:type="dxa"/>
+              <w:bottom w:w="120" w:type="dxa"/>
+              <w:right w:w="180" w:type="dxa"/>
+            </w:tcMar>
+            <w:vAlign w:val="center"/>
+            <w:hideMark/>
+          </w:tcPr>
+          <w:p>
+            <w:r>
+              <w:rPr>
+                <w:b/>
+                <w:bCs/>
+              </w:rPr>
+              <w:t>WRX90 Workstation Motherboard</w:t>
+            </w:r>
+            <w:r>
+              <w:t xml:space="preserve"> (Supports 8-channel memory and massive ECC RAM capacities).</w:t>
+            </w:r>
+          </w:p>
+        </w:tc>
+        <w:tc>
+          <w:tcPr>
+            <w:tcW w:w="0" w:type="auto"/>
+            <w:tcBorders>
+              <w:top w:val="single" w:sz="6" w:space="0" w:color="C4C7C5"/>
+              <w:left w:val="single" w:sz="6" w:space="0" w:color="C4C7C5"/>
+              <w:bottom w:val="single" w:sz="6" w:space="0" w:color="C4C7C5"/>
+              <w:right w:val="single" w:sz="6" w:space="0" w:color="C4C7C5"/>
+            </w:tcBorders>
+            <w:tcMar>
+              <w:top w:w="120" w:type="dxa"/>
+              <w:left w:w="180" w:type="dxa"/>
+              <w:bottom w:w="120" w:type="dxa"/>
+              <w:right w:w="180" w:type="dxa"/>
+            </w:tcMar>
+            <w:vAlign w:val="center"/>
+            <w:hideMark/>
+          </w:tcPr>
+          <w:p>
+            <w:r>
+              <w:t>₹ 1,20,000</w:t>
+            </w:r>
+          </w:p>
+        </w:tc>
+      </w:tr>
+      <w:tr>
+        <w:trPr>
+          <w:tblCellSpacing w:w="15" w:type="dxa"/>
+        </w:trPr>
+        <w:tc>
+          <w:tcPr>
+            <w:tcW w:w="0" w:type="auto"/>
+            <w:tcBorders>
+              <w:top w:val="single" w:sz="6" w:space="0" w:color="C4C7C5"/>
+              <w:left w:val="single" w:sz="6" w:space="0" w:color="C4C7C5"/>
+              <w:bottom w:val="single" w:sz="6" w:space="0" w:color="C4C7C5"/>
+              <w:right w:val="single" w:sz="6" w:space="0" w:color="C4C7C5"/>
+            </w:tcBorders>
+            <w:tcMar>
+              <w:top w:w="120" w:type="dxa"/>
+              <w:left w:w="180" w:type="dxa"/>
+              <w:bottom w:w="120" w:type="dxa"/>
+              <w:right w:w="180" w:type="dxa"/>
+            </w:tcMar>
+            <w:vAlign w:val="center"/>
+            <w:hideMark/>
+          </w:tcPr>
+          <w:p>
+            <w:r>
+              <w:rPr>
+                <w:b/>
+                <w:bCs/>
+              </w:rPr>
+              <w:t>RAM (The "VRAM" Replacement)</w:t>
+            </w:r>
+          </w:p>
+        </w:tc>
+        <w:tc>
+          <w:tcPr>
+            <w:tcW w:w="0" w:type="auto"/>
+            <w:tcBorders>
+              <w:top w:val="single" w:sz="6" w:space="0" w:color="C4C7C5"/>
+              <w:left w:val="single" w:sz="6" w:space="0" w:color="C4C7C5"/>
+              <w:bottom w:val="single" w:sz="6" w:space="0" w:color="C4C7C5"/>
+              <w:right w:val="single" w:sz="6" w:space="0" w:color="C4C7C5"/>
+            </w:tcBorders>
+            <w:tcMar>
+              <w:top w:w="120" w:type="dxa"/>
+              <w:left w:w="180" w:type="dxa"/>
+              <w:bottom w:w="120" w:type="dxa"/>
+              <w:right w:w="180" w:type="dxa"/>
+            </w:tcMar>
+            <w:vAlign w:val="center"/>
+            <w:hideMark/>
+          </w:tcPr>
+          <w:p>
+            <w:r>
+              <w:rPr>
+                <w:b/>
+                <w:bCs/>
+              </w:rPr>
+              <w:t>256 GB ECC DDR5 (8x 32GB Sticks)</w:t>
+            </w:r>
+            <w:r>
+              <w:t xml:space="preserve">. </w:t>
+            </w:r>
+            <w:r>
+              <w:rPr>
+                <w:i/>
+                <w:iCs/>
+              </w:rPr>
+              <w:t>Why?</w:t>
+            </w:r>
+            <w:r>
+              <w:t xml:space="preserve"> By populating all 8 channels, you get massive bandwidth. 256GB allows you to load massive 70B to 120B parameter models entirely into RAM.</w:t>
+            </w:r>
+          </w:p>
+        </w:tc>
+        <w:tc>
+          <w:tcPr>
+            <w:tcW w:w="0" w:type="auto"/>
+            <w:tcBorders>
+              <w:top w:val="single" w:sz="6" w:space="0" w:color="C4C7C5"/>
+              <w:left w:val="single" w:sz="6" w:space="0" w:color="C4C7C5"/>
+              <w:bottom w:val="single" w:sz="6" w:space="0" w:color="C4C7C5"/>
+              <w:right w:val="single" w:sz="6" w:space="0" w:color="C4C7C5"/>
+            </w:tcBorders>
+            <w:tcMar>
+              <w:top w:w="120" w:type="dxa"/>
+              <w:left w:w="180" w:type="dxa"/>
+              <w:bottom w:w="120" w:type="dxa"/>
+              <w:right w:w="180" w:type="dxa"/>
+            </w:tcMar>
+            <w:vAlign w:val="center"/>
+            <w:hideMark/>
+          </w:tcPr>
+          <w:p>
+            <w:r>
+              <w:t>₹ 1,20,000</w:t>
+            </w:r>
+          </w:p>
+        </w:tc>
+      </w:tr>
+      <w:tr>
+        <w:trPr>
+          <w:tblCellSpacing w:w="15" w:type="dxa"/>
+        </w:trPr>
+        <w:tc>
+          <w:tcPr>
+            <w:tcW w:w="0" w:type="auto"/>
+            <w:tcBorders>
+              <w:top w:val="single" w:sz="6" w:space="0" w:color="C4C7C5"/>
+              <w:left w:val="single" w:sz="6" w:space="0" w:color="C4C7C5"/>
+              <w:bottom w:val="single" w:sz="6" w:space="0" w:color="C4C7C5"/>
+              <w:right w:val="single" w:sz="6" w:space="0" w:color="C4C7C5"/>
+            </w:tcBorders>
+            <w:tcMar>
+              <w:top w:w="120" w:type="dxa"/>
+              <w:left w:w="180" w:type="dxa"/>
+              <w:bottom w:w="120" w:type="dxa"/>
+              <w:right w:w="180" w:type="dxa"/>
+            </w:tcMar>
+            <w:vAlign w:val="center"/>
+            <w:hideMark/>
+          </w:tcPr>
+          <w:p>
+            <w:r>
+              <w:rPr>
+                <w:b/>
+                <w:bCs/>
+              </w:rPr>
+              <w:t>Storage</w:t>
+            </w:r>
+          </w:p>
+        </w:tc>
+        <w:tc>
+          <w:tcPr>
+            <w:tcW w:w="0" w:type="auto"/>
+            <w:tcBorders>
+              <w:top w:val="single" w:sz="6" w:space="0" w:color="C4C7C5"/>
+              <w:left w:val="single" w:sz="6" w:space="0" w:color="C4C7C5"/>
+              <w:bottom w:val="single" w:sz="6" w:space="0" w:color="C4C7C5"/>
+              <w:right w:val="single" w:sz="6" w:space="0" w:color="C4C7C5"/>
+            </w:tcBorders>
+            <w:tcMar>
+              <w:top w:w="120" w:type="dxa"/>
+              <w:left w:w="180" w:type="dxa"/>
+              <w:bottom w:w="120" w:type="dxa"/>
+              <w:right w:w="180" w:type="dxa"/>
+            </w:tcMar>
+            <w:vAlign w:val="center"/>
+            <w:hideMark/>
+          </w:tcPr>
+          <w:p>
+            <w:r>
+              <w:t xml:space="preserve">2x 2TB </w:t>
+            </w:r>
+            <w:proofErr w:type="spellStart"/>
+            <w:r>
+              <w:t>NVMe</w:t>
+            </w:r>
+            <w:proofErr w:type="spellEnd"/>
+            <w:r>
+              <w:t xml:space="preserve"> Gen 4 M.2 SSDs (Crucial for loading the massive model weights into RAM quickly upon boot).</w:t>
+            </w:r>
+          </w:p>
+        </w:tc>
+        <w:tc>
+          <w:tcPr>
+            <w:tcW w:w="0" w:type="auto"/>
+            <w:tcBorders>
+              <w:top w:val="single" w:sz="6" w:space="0" w:color="C4C7C5"/>
+              <w:left w:val="single" w:sz="6" w:space="0" w:color="C4C7C5"/>
+              <w:bottom w:val="single" w:sz="6" w:space="0" w:color="C4C7C5"/>
+              <w:right w:val="single" w:sz="6" w:space="0" w:color="C4C7C5"/>
+            </w:tcBorders>
+            <w:tcMar>
+              <w:top w:w="120" w:type="dxa"/>
+              <w:left w:w="180" w:type="dxa"/>
+              <w:bottom w:w="120" w:type="dxa"/>
+              <w:right w:w="180" w:type="dxa"/>
+            </w:tcMar>
+            <w:vAlign w:val="center"/>
+            <w:hideMark/>
+          </w:tcPr>
+          <w:p>
+            <w:r>
+              <w:t>₹ 35,000</w:t>
+            </w:r>
+          </w:p>
+        </w:tc>
+      </w:tr>
+      <w:tr>
+        <w:trPr>
+          <w:tblCellSpacing w:w="15" w:type="dxa"/>
+        </w:trPr>
+        <w:tc>
+          <w:tcPr>
+            <w:tcW w:w="0" w:type="auto"/>
+            <w:tcBorders>
+              <w:top w:val="single" w:sz="6" w:space="0" w:color="C4C7C5"/>
+              <w:left w:val="single" w:sz="6" w:space="0" w:color="C4C7C5"/>
+              <w:bottom w:val="single" w:sz="6" w:space="0" w:color="C4C7C5"/>
+              <w:right w:val="single" w:sz="6" w:space="0" w:color="C4C7C5"/>
+            </w:tcBorders>
+            <w:tcMar>
+              <w:top w:w="120" w:type="dxa"/>
+              <w:left w:w="180" w:type="dxa"/>
+              <w:bottom w:w="120" w:type="dxa"/>
+              <w:right w:w="180" w:type="dxa"/>
+            </w:tcMar>
+            <w:vAlign w:val="center"/>
+            <w:hideMark/>
+          </w:tcPr>
+          <w:p>
+            <w:r>
+              <w:rPr>
+                <w:b/>
+                <w:bCs/>
+              </w:rPr>
+              <w:t>Chassis &amp; Power</w:t>
+            </w:r>
+          </w:p>
+        </w:tc>
+        <w:tc>
+          <w:tcPr>
+            <w:tcW w:w="0" w:type="auto"/>
+            <w:tcBorders>
+              <w:top w:val="single" w:sz="6" w:space="0" w:color="C4C7C5"/>
+              <w:left w:val="single" w:sz="6" w:space="0" w:color="C4C7C5"/>
+              <w:bottom w:val="single" w:sz="6" w:space="0" w:color="C4C7C5"/>
+              <w:right w:val="single" w:sz="6" w:space="0" w:color="C4C7C5"/>
+            </w:tcBorders>
+            <w:tcMar>
+              <w:top w:w="120" w:type="dxa"/>
+              <w:left w:w="180" w:type="dxa"/>
+              <w:bottom w:w="120" w:type="dxa"/>
+              <w:right w:w="180" w:type="dxa"/>
+            </w:tcMar>
+            <w:vAlign w:val="center"/>
+            <w:hideMark/>
+          </w:tcPr>
+          <w:p>
+            <w:r>
+              <w:t>Full-Tower Workstation Case + 1000W 80+ Gold Power Supply.</w:t>
+            </w:r>
+          </w:p>
+        </w:tc>
+        <w:tc>
+          <w:tcPr>
+            <w:tcW w:w="0" w:type="auto"/>
+            <w:tcBorders>
+              <w:top w:val="single" w:sz="6" w:space="0" w:color="C4C7C5"/>
+              <w:left w:val="single" w:sz="6" w:space="0" w:color="C4C7C5"/>
+              <w:bottom w:val="single" w:sz="6" w:space="0" w:color="C4C7C5"/>
+              <w:right w:val="single" w:sz="6" w:space="0" w:color="C4C7C5"/>
+            </w:tcBorders>
+            <w:tcMar>
+              <w:top w:w="120" w:type="dxa"/>
+              <w:left w:w="180" w:type="dxa"/>
+              <w:bottom w:w="120" w:type="dxa"/>
+              <w:right w:w="180" w:type="dxa"/>
+            </w:tcMar>
+            <w:vAlign w:val="center"/>
+            <w:hideMark/>
+          </w:tcPr>
+          <w:p>
+            <w:r>
+              <w:t>₹ 30,000</w:t>
+            </w:r>
+          </w:p>
+        </w:tc>
+      </w:tr>
+      <w:tr>
+        <w:trPr>
+          <w:tblCellSpacing w:w="15" w:type="dxa"/>
+        </w:trPr>
+        <w:tc>
+          <w:tcPr>
+            <w:tcW w:w="0" w:type="auto"/>
+            <w:tcBorders>
+              <w:top w:val="single" w:sz="6" w:space="0" w:color="C4C7C5"/>
+              <w:left w:val="single" w:sz="6" w:space="0" w:color="C4C7C5"/>
+              <w:bottom w:val="single" w:sz="6" w:space="0" w:color="C4C7C5"/>
+              <w:right w:val="single" w:sz="6" w:space="0" w:color="C4C7C5"/>
+            </w:tcBorders>
+            <w:tcMar>
+              <w:top w:w="120" w:type="dxa"/>
+              <w:left w:w="180" w:type="dxa"/>
+              <w:bottom w:w="120" w:type="dxa"/>
+              <w:right w:w="180" w:type="dxa"/>
+            </w:tcMar>
+            <w:vAlign w:val="center"/>
+            <w:hideMark/>
+          </w:tcPr>
+          <w:p>
+            <w:r>
+              <w:rPr>
+                <w:b/>
+                <w:bCs/>
+              </w:rPr>
+              <w:t>Thermal &amp; Networking</w:t>
+            </w:r>
+          </w:p>
+        </w:tc>
+        <w:tc>
+          <w:tcPr>
+            <w:tcW w:w="0" w:type="auto"/>
+            <w:tcBorders>
+              <w:top w:val="single" w:sz="6" w:space="0" w:color="C4C7C5"/>
+              <w:left w:val="single" w:sz="6" w:space="0" w:color="C4C7C5"/>
+              <w:bottom w:val="single" w:sz="6" w:space="0" w:color="C4C7C5"/>
+              <w:right w:val="single" w:sz="6" w:space="0" w:color="C4C7C5"/>
+            </w:tcBorders>
+            <w:tcMar>
+              <w:top w:w="120" w:type="dxa"/>
+              <w:left w:w="180" w:type="dxa"/>
+              <w:bottom w:w="120" w:type="dxa"/>
+              <w:right w:w="180" w:type="dxa"/>
+            </w:tcMar>
+            <w:vAlign w:val="center"/>
+            <w:hideMark/>
+          </w:tcPr>
+          <w:p>
+            <w:r>
+              <w:t xml:space="preserve">High-end CPU Air Cooler (e.g., Noctua </w:t>
+            </w:r>
+            <w:proofErr w:type="spellStart"/>
+            <w:r>
+              <w:t>Threadripper</w:t>
+            </w:r>
+            <w:proofErr w:type="spellEnd"/>
+            <w:r>
+              <w:t xml:space="preserve"> edition) + 10GbE Network Card.</w:t>
+            </w:r>
+          </w:p>
+        </w:tc>
+        <w:tc>
+          <w:tcPr>
+            <w:tcW w:w="0" w:type="auto"/>
+            <w:tcBorders>
+              <w:top w:val="single" w:sz="6" w:space="0" w:color="C4C7C5"/>
+              <w:left w:val="single" w:sz="6" w:space="0" w:color="C4C7C5"/>
+              <w:bottom w:val="single" w:sz="6" w:space="0" w:color="C4C7C5"/>
+              <w:right w:val="single" w:sz="6" w:space="0" w:color="C4C7C5"/>
+            </w:tcBorders>
+            <w:tcMar>
+              <w:top w:w="120" w:type="dxa"/>
+              <w:left w:w="180" w:type="dxa"/>
+              <w:bottom w:w="120" w:type="dxa"/>
+              <w:right w:w="180" w:type="dxa"/>
+            </w:tcMar>
+            <w:vAlign w:val="center"/>
+            <w:hideMark/>
+          </w:tcPr>
+          <w:p>
+            <w:r>
+              <w:t>₹ 25,000</w:t>
+            </w:r>
+          </w:p>
+        </w:tc>
+      </w:tr>
+      <w:tr>
+        <w:trPr>
+          <w:tblCellSpacing w:w="15" w:type="dxa"/>
+        </w:trPr>
+        <w:tc>
+          <w:tcPr>
+            <w:tcW w:w="0" w:type="auto"/>
+            <w:tcBorders>
+              <w:top w:val="single" w:sz="6" w:space="0" w:color="C4C7C5"/>
+              <w:left w:val="single" w:sz="6" w:space="0" w:color="C4C7C5"/>
+              <w:bottom w:val="single" w:sz="6" w:space="0" w:color="C4C7C5"/>
+              <w:right w:val="single" w:sz="6" w:space="0" w:color="C4C7C5"/>
+            </w:tcBorders>
+            <w:tcMar>
+              <w:top w:w="120" w:type="dxa"/>
+              <w:left w:w="180" w:type="dxa"/>
+              <w:bottom w:w="120" w:type="dxa"/>
+              <w:right w:w="180" w:type="dxa"/>
+            </w:tcMar>
+            <w:vAlign w:val="center"/>
+            <w:hideMark/>
+          </w:tcPr>
+          <w:p>
+            <w:r>
+              <w:rPr>
+                <w:b/>
+                <w:bCs/>
+              </w:rPr>
+              <w:t>Power Protection</w:t>
+            </w:r>
+          </w:p>
+        </w:tc>
+        <w:tc>
+          <w:tcPr>
+            <w:tcW w:w="0" w:type="auto"/>
+            <w:tcBorders>
+              <w:top w:val="single" w:sz="6" w:space="0" w:color="C4C7C5"/>
+              <w:left w:val="single" w:sz="6" w:space="0" w:color="C4C7C5"/>
+              <w:bottom w:val="single" w:sz="6" w:space="0" w:color="C4C7C5"/>
+              <w:right w:val="single" w:sz="6" w:space="0" w:color="C4C7C5"/>
+            </w:tcBorders>
+            <w:tcMar>
+              <w:top w:w="120" w:type="dxa"/>
+              <w:left w:w="180" w:type="dxa"/>
+              <w:bottom w:w="120" w:type="dxa"/>
+              <w:right w:w="180" w:type="dxa"/>
+            </w:tcMar>
+            <w:vAlign w:val="center"/>
+            <w:hideMark/>
+          </w:tcPr>
+          <w:p>
+            <w:r>
+              <w:t>2 kVA Online UPS (Since we dropped the GPUs, power draw is much lower).</w:t>
+            </w:r>
+          </w:p>
+        </w:tc>
+        <w:tc>
+          <w:tcPr>
+            <w:tcW w:w="0" w:type="auto"/>
+            <w:tcBorders>
+              <w:top w:val="single" w:sz="6" w:space="0" w:color="C4C7C5"/>
+              <w:left w:val="single" w:sz="6" w:space="0" w:color="C4C7C5"/>
+              <w:bottom w:val="single" w:sz="6" w:space="0" w:color="C4C7C5"/>
+              <w:right w:val="single" w:sz="6" w:space="0" w:color="C4C7C5"/>
+            </w:tcBorders>
+            <w:tcMar>
+              <w:top w:w="120" w:type="dxa"/>
+              <w:left w:w="180" w:type="dxa"/>
+              <w:bottom w:w="120" w:type="dxa"/>
+              <w:right w:w="180" w:type="dxa"/>
+            </w:tcMar>
+            <w:vAlign w:val="center"/>
+            <w:hideMark/>
+          </w:tcPr>
+          <w:p>
+            <w:r>
+              <w:t>₹ 25,000</w:t>
+            </w:r>
+          </w:p>
+        </w:tc>
+      </w:tr>
+      <w:tr>
+        <w:trPr>
+          <w:tblCellSpacing w:w="15" w:type="dxa"/>
+        </w:trPr>
+        <w:tc>
+          <w:tcPr>
+            <w:tcW w:w="0" w:type="auto"/>
+            <w:tcBorders>
+              <w:top w:val="single" w:sz="6" w:space="0" w:color="C4C7C5"/>
+              <w:left w:val="single" w:sz="6" w:space="0" w:color="C4C7C5"/>
+              <w:bottom w:val="single" w:sz="6" w:space="0" w:color="C4C7C5"/>
+              <w:right w:val="single" w:sz="6" w:space="0" w:color="C4C7C5"/>
+            </w:tcBorders>
+            <w:tcMar>
+              <w:top w:w="120" w:type="dxa"/>
+              <w:left w:w="180" w:type="dxa"/>
+              <w:bottom w:w="120" w:type="dxa"/>
+              <w:right w:w="180" w:type="dxa"/>
+            </w:tcMar>
+            <w:vAlign w:val="center"/>
+            <w:hideMark/>
+          </w:tcPr>
+          <w:p>
+            <w:r>
+              <w:rPr>
+                <w:b/>
+                <w:bCs/>
+              </w:rPr>
+              <w:lastRenderedPageBreak/>
+              <w:t xml:space="preserve">Total Estimated </w:t>
+            </w:r>
+            <w:proofErr w:type="spellStart"/>
+            <w:r>
+              <w:rPr>
+                <w:b/>
+                <w:bCs/>
+              </w:rPr>
+              <w:t>CapEx</w:t>
+            </w:r>
+            <w:proofErr w:type="spellEnd"/>
+          </w:p>
+        </w:tc>
+        <w:tc>
+          <w:tcPr>
+            <w:tcW w:w="0" w:type="auto"/>
+            <w:tcBorders>
+              <w:top w:val="single" w:sz="6" w:space="0" w:color="C4C7C5"/>
+              <w:left w:val="single" w:sz="6" w:space="0" w:color="C4C7C5"/>
+              <w:bottom w:val="single" w:sz="6" w:space="0" w:color="C4C7C5"/>
+              <w:right w:val="single" w:sz="6" w:space="0" w:color="C4C7C5"/>
+            </w:tcBorders>
+            <w:tcMar>
+              <w:top w:w="120" w:type="dxa"/>
+              <w:left w:w="180" w:type="dxa"/>
+              <w:bottom w:w="120" w:type="dxa"/>
+              <w:right w:w="180" w:type="dxa"/>
+            </w:tcMar>
+            <w:vAlign w:val="center"/>
+            <w:hideMark/>
+          </w:tcPr>
+          <w:p>
+            <w:r>
+              <w:rPr>
+                <w:b/>
+                <w:bCs/>
+              </w:rPr>
+              <w:t>~₹ 5,85,000</w:t>
+            </w:r>
+          </w:p>
+        </w:tc>
+        <w:tc>
+          <w:tcPr>
+            <w:tcW w:w="0" w:type="auto"/>
+            <w:tcBorders>
+              <w:top w:val="single" w:sz="6" w:space="0" w:color="C4C7C5"/>
+              <w:left w:val="single" w:sz="6" w:space="0" w:color="C4C7C5"/>
+              <w:bottom w:val="single" w:sz="6" w:space="0" w:color="C4C7C5"/>
+              <w:right w:val="single" w:sz="6" w:space="0" w:color="C4C7C5"/>
+            </w:tcBorders>
+            <w:tcMar>
+              <w:top w:w="120" w:type="dxa"/>
+              <w:left w:w="180" w:type="dxa"/>
+              <w:bottom w:w="120" w:type="dxa"/>
+              <w:right w:w="180" w:type="dxa"/>
+            </w:tcMar>
+            <w:vAlign w:val="center"/>
+            <w:hideMark/>
+          </w:tcPr>
+          <w:p/>
+        </w:tc>
+      </w:tr>
+    </w:tbl>
+    <w:p>
+      <w:r>
+        <w:rPr>
+          <w:b/>
+          <w:bCs/>
+        </w:rPr>
+        <w:t>Budget Note:</w:t>
+      </w:r>
+      <w:r>
+        <w:t xml:space="preserve"> This setup comes in at </w:t>
+      </w:r>
+      <w:r>
+        <w:rPr>
+          <w:b/>
+          <w:bCs/>
+        </w:rPr>
+        <w:t>under ₹6 Lakhs</w:t>
+      </w:r>
+      <w:r>
+        <w:t xml:space="preserve">—nearly half of your ₹10 Lakh limit. If </w:t>
+      </w:r>
+      <w:r>
+        <w:t>we</w:t>
+      </w:r>
+      <w:r>
+        <w:t xml:space="preserve"> want even more power, </w:t>
+      </w:r>
+      <w:r>
+        <w:t>we</w:t>
+      </w:r>
+      <w:r>
+        <w:t xml:space="preserve"> could upgrade to a 32-core </w:t>
+      </w:r>
+      <w:proofErr w:type="spellStart"/>
+      <w:r>
+        <w:t>Threadripper</w:t>
+      </w:r>
+      <w:proofErr w:type="spellEnd"/>
+      <w:r>
+        <w:t xml:space="preserve"> PRO or double the RAM to </w:t>
+      </w:r>
+      <w:r>
+        <w:rPr>
+          <w:b/>
+          <w:bCs/>
+        </w:rPr>
+        <w:t>512 GB</w:t>
+      </w:r>
+      <w:r>
+        <w:t xml:space="preserve"> (approx. ₹2.4L) and still stay well under the ₹10 Lakh budget.</w:t>
+      </w:r>
+    </w:p>
+    <w:p>
+      <w:pPr>
+        <w:rPr>
+          <w:b/>
+          <w:bCs/>
+        </w:rPr>
+      </w:pPr>
+      <w:r>
+        <w:rPr>
+          <w:b/>
+          <w:bCs/>
+        </w:rPr>
+        <w:t>The Software Stack (Optimized for CPU)</w:t>
+      </w:r>
+    </w:p>
+    <w:p>
+      <w:r>
+        <w:t xml:space="preserve">You cannot use standard GPU software (like standard </w:t>
+      </w:r>
+      <w:proofErr w:type="spellStart"/>
+      <w:r>
+        <w:t>vLLM</w:t>
+      </w:r>
+      <w:proofErr w:type="spellEnd"/>
+      <w:r>
+        <w:t xml:space="preserve"> or CUDA). Your software stack must be explicitly designed for CPU acceleration.</w:t>
+      </w:r>
+    </w:p>
+    <w:p>
+      <w:pPr>
+        <w:numPr>
+          <w:ilvl w:val="0"/>
+          <w:numId w:val="14"/>
+        </w:numPr>
+      </w:pPr>
+      <w:r>
+        <w:rPr>
+          <w:b/>
+          <w:bCs/>
+        </w:rPr>
+        <w:t>The Backend Engine:</w:t>
+      </w:r>
+      <w:r>
+        <w:t xml:space="preserve"> You will use </w:t>
+      </w:r>
+      <w:r>
+        <w:rPr>
+          <w:b/>
+          <w:bCs/>
+        </w:rPr>
+        <w:t>llama.cpp</w:t>
+      </w:r>
+      <w:r>
+        <w:t xml:space="preserve"> or </w:t>
+      </w:r>
+      <w:proofErr w:type="spellStart"/>
+      <w:r>
+        <w:rPr>
+          <w:b/>
+          <w:bCs/>
+        </w:rPr>
+        <w:t>Ollama</w:t>
+      </w:r>
+      <w:proofErr w:type="spellEnd"/>
+      <w:r>
+        <w:t xml:space="preserve"> (which uses llama.cpp under the hood). This engine is famously optimized for CPU inference and natively supports AVX-512 instructions.</w:t>
+      </w:r>
+    </w:p>
+    <w:p>
+      <w:pPr>
+        <w:numPr>
+          <w:ilvl w:val="0"/>
+          <w:numId w:val="14"/>
+        </w:numPr>
+      </w:pPr>
+      <w:r>
+        <w:rPr>
+          <w:b/>
+          <w:bCs/>
+        </w:rPr>
+        <w:t>The Interface:</w:t>
+      </w:r>
+      <w:r>
+        <w:t xml:space="preserve"> </w:t>
+      </w:r>
+      <w:r>
+        <w:rPr>
+          <w:b/>
+          <w:bCs/>
+        </w:rPr>
+        <w:t xml:space="preserve">Open </w:t>
+      </w:r>
+      <w:proofErr w:type="spellStart"/>
+      <w:r>
+        <w:rPr>
+          <w:b/>
+          <w:bCs/>
+        </w:rPr>
+        <w:t>WebUI</w:t>
+      </w:r>
+      <w:proofErr w:type="spellEnd"/>
+      <w:r>
+        <w:t>. This gives your researcher a beautiful, ChatGPT-like interface running securely on localhost:8080.</w:t>
+      </w:r>
+    </w:p>
+    <w:p>
+      <w:pPr>
+        <w:numPr>
+          <w:ilvl w:val="0"/>
+          <w:numId w:val="14"/>
+        </w:numPr>
+      </w:pPr>
+      <w:r>
+        <w:rPr>
+          <w:b/>
+          <w:bCs/>
+        </w:rPr>
+        <w:t>The Models (Quantized GGUF format):</w:t>
+      </w:r>
+      <w:r>
+        <w:t xml:space="preserve"> You must download models in </w:t>
       </w:r>
       <w:proofErr w:type="gramStart"/>
       <w:r>
-        <w:t>Implementations :</w:t>
-      </w:r>
+        <w:t>the .</w:t>
+      </w:r>
+      <w:proofErr w:type="spellStart"/>
+      <w:r>
+        <w:t>gguf</w:t>
+      </w:r>
+      <w:proofErr w:type="spellEnd"/>
       <w:proofErr w:type="gramEnd"/>
       <w:r>
+        <w:t xml:space="preserve"> format, which is specifically designed for CPU execution.</w:t>
+      </w:r>
+    </w:p>
+    <w:p>
+      <w:pPr>
+        <w:rPr>
+          <w:b/>
+          <w:bCs/>
+        </w:rPr>
+      </w:pPr>
+      <w:r>
+        <w:rPr>
+          <w:b/>
+          <w:bCs/>
+        </w:rPr>
+        <w:t>What Can This Setup Actually Do? (Performance Expectations)</w:t>
+      </w:r>
+    </w:p>
+    <w:p>
+      <w:r>
+        <w:t>When a researcher sits down at this machine, they will experience a highly capable, offline AI environment. Here is how it performs:</w:t>
+      </w:r>
+    </w:p>
+    <w:p>
+      <w:r>
+        <w:rPr>
+          <w:b/>
+          <w:bCs/>
+        </w:rPr>
+        <w:t>1. The "Daily Driver" Models (8B to 14B Parameters)</w:t>
+      </w:r>
+    </w:p>
+    <w:p>
+      <w:pPr>
+        <w:numPr>
+          <w:ilvl w:val="0"/>
+          <w:numId w:val="15"/>
+        </w:numPr>
+      </w:pPr>
+      <w:r>
+        <w:rPr>
+          <w:b/>
+          <w:bCs/>
+        </w:rPr>
+        <w:t>Models:</w:t>
+      </w:r>
+      <w:r>
+        <w:t xml:space="preserve"> Llama-3 (8B), Qwen 2.5 Coder (14B).</w:t>
+      </w:r>
+    </w:p>
+    <w:p>
+      <w:pPr>
+        <w:numPr>
+          <w:ilvl w:val="0"/>
+          <w:numId w:val="15"/>
+        </w:numPr>
+      </w:pPr>
+      <w:r>
+        <w:rPr>
+          <w:b/>
+          <w:bCs/>
+        </w:rPr>
+        <w:t>Performance:</w:t>
+      </w:r>
+      <w:r>
+        <w:t xml:space="preserve"> With 8-channel DDR5 memory, the CPU will generate </w:t>
+      </w:r>
+      <w:r>
+        <w:rPr>
+          <w:b/>
+          <w:bCs/>
+        </w:rPr>
+        <w:t>30 to 45 tokens per second</w:t>
+      </w:r>
+      <w:r>
+        <w:t xml:space="preserve"> (faster than human reading speed).</w:t>
+      </w:r>
+    </w:p>
+    <w:p>
+      <w:pPr>
+        <w:numPr>
+          <w:ilvl w:val="0"/>
+          <w:numId w:val="15"/>
+        </w:numPr>
+      </w:pPr>
+      <w:r>
+        <w:rPr>
+          <w:b/>
+          <w:bCs/>
+        </w:rPr>
+        <w:t>Use Case:</w:t>
+      </w:r>
+      <w:r>
+        <w:t xml:space="preserve"> Real-time code generation, quick policy Q&amp;A, and fast email drafting.</w:t>
+      </w:r>
+    </w:p>
+    <w:p>
+      <w:r>
+        <w:rPr>
+          <w:b/>
+          <w:bCs/>
+        </w:rPr>
+        <w:t>2. The Enterprise Heavyweights (32B to 70B Parameters)</w:t>
+      </w:r>
+    </w:p>
+    <w:p>
+      <w:pPr>
+        <w:numPr>
+          <w:ilvl w:val="0"/>
+          <w:numId w:val="16"/>
+        </w:numPr>
+      </w:pPr>
+      <w:r>
+        <w:rPr>
+          <w:b/>
+          <w:bCs/>
+        </w:rPr>
+        <w:t>Models:</w:t>
+      </w:r>
+      <w:r>
+        <w:t xml:space="preserve"> Llama-3.1 (70B), Qwen-2.5 (32B), or DeepSeek R1 </w:t>
+      </w:r>
+      <w:proofErr w:type="spellStart"/>
+      <w:r>
+        <w:t>Distill</w:t>
+      </w:r>
+      <w:proofErr w:type="spellEnd"/>
+      <w:r>
+        <w:t xml:space="preserve"> (70B).</w:t>
+      </w:r>
+    </w:p>
+    <w:p>
+      <w:pPr>
+        <w:numPr>
+          <w:ilvl w:val="0"/>
+          <w:numId w:val="16"/>
+        </w:numPr>
+      </w:pPr>
+      <w:r>
+        <w:rPr>
+          <w:b/>
+          <w:bCs/>
+        </w:rPr>
+        <w:t>Performance:</w:t>
+      </w:r>
+      <w:r>
+        <w:t xml:space="preserve"> The researcher can expect </w:t>
+      </w:r>
+      <w:r>
+        <w:rPr>
+          <w:b/>
+          <w:bCs/>
+        </w:rPr>
+        <w:t>6 to 12 tokens per second</w:t>
+      </w:r>
+      <w:r>
+        <w:t>. While you can see the text generating word-by-word, it is highly usable for deep reasoning tasks.</w:t>
+      </w:r>
+    </w:p>
+    <w:p>
+      <w:pPr>
+        <w:numPr>
+          <w:ilvl w:val="0"/>
+          <w:numId w:val="16"/>
+        </w:numPr>
+      </w:pPr>
+      <w:r>
+        <w:rPr>
+          <w:b/>
+          <w:bCs/>
+        </w:rPr>
+        <w:t>Use Case:</w:t>
+      </w:r>
+      <w:r>
+        <w:t xml:space="preserve"> Deep algorithmic logic, </w:t>
+      </w:r>
+      <w:proofErr w:type="spellStart"/>
+      <w:r>
+        <w:t>analyzing</w:t>
+      </w:r>
+      <w:proofErr w:type="spellEnd"/>
+      <w:r>
+        <w:t xml:space="preserve"> complex 50-page financial contracts (RAG), and executing multi-step logic where accuracy matters more than raw speed.</w:t>
+      </w:r>
+    </w:p>
+    <w:p>
+      <w:r>
+        <w:rPr>
+          <w:b/>
+          <w:bCs/>
+        </w:rPr>
+        <w:lastRenderedPageBreak/>
+        <w:t>3. The Impossible Tier (100B+ Parameters)</w:t>
+      </w:r>
+    </w:p>
+    <w:p>
+      <w:pPr>
+        <w:numPr>
+          <w:ilvl w:val="0"/>
+          <w:numId w:val="17"/>
+        </w:numPr>
+      </w:pPr>
+      <w:r>
+        <w:rPr>
+          <w:b/>
+          <w:bCs/>
+        </w:rPr>
+        <w:t>Models:</w:t>
+      </w:r>
+      <w:r>
+        <w:t xml:space="preserve"> Command R+ (104B), </w:t>
+      </w:r>
+      <w:proofErr w:type="spellStart"/>
+      <w:r>
+        <w:t>Mixtral</w:t>
+      </w:r>
+      <w:proofErr w:type="spellEnd"/>
+      <w:r>
+        <w:t xml:space="preserve"> 8x22B (141B).</w:t>
+      </w:r>
+    </w:p>
+    <w:p>
+      <w:pPr>
+        <w:numPr>
+          <w:ilvl w:val="0"/>
+          <w:numId w:val="17"/>
+        </w:numPr>
+      </w:pPr>
+      <w:r>
+        <w:rPr>
+          <w:b/>
+          <w:bCs/>
+        </w:rPr>
+        <w:t>Performance:</w:t>
+      </w:r>
+      <w:r>
+        <w:t xml:space="preserve"> Because you have 256GB of system RAM, you can physically load models that would otherwise require $80,000 worth of GPUs. They will run slowly (around 2 to 5 tokens per second), but the researcher has access to frontier-level intelligence for complex batch processing or overnight logic testing.</w:t>
+      </w:r>
+    </w:p>
+    <w:p>
+      <w:pPr>
+        <w:rPr>
+          <w:b/>
+          <w:bCs/>
+        </w:rPr>
+      </w:pPr>
+      <w:r>
+        <w:rPr>
+          <w:b/>
+          <w:bCs/>
+        </w:rPr>
+        <w:t>Advantages of the CPU-Only Approach</w:t>
+      </w:r>
+    </w:p>
+    <w:p>
+      <w:pPr>
+        <w:numPr>
+          <w:ilvl w:val="0"/>
+          <w:numId w:val="18"/>
+        </w:numPr>
+      </w:pPr>
+      <w:r>
+        <w:rPr>
+          <w:b/>
+          <w:bCs/>
+        </w:rPr>
+        <w:t>Massive Cost Savings:</w:t>
+      </w:r>
+      <w:r>
+        <w:t xml:space="preserve"> No expensive GPUs, no expensive cooling, and standard workstation power requirements.</w:t>
+      </w:r>
+    </w:p>
+    <w:p>
+      <w:pPr>
+        <w:numPr>
+          <w:ilvl w:val="0"/>
+          <w:numId w:val="18"/>
+        </w:numPr>
+      </w:pPr>
+      <w:r>
+        <w:rPr>
+          <w:b/>
+          <w:bCs/>
+        </w:rPr>
+        <w:t>No Model Size Limits:</w:t>
+      </w:r>
+      <w:r>
+        <w:t xml:space="preserve"> If a new open-source 150-Billion parameter model drops tomorrow, your researcher can test it immediately because they have 256GB of RAM. A 48GB GPU setup would physically crash </w:t>
+      </w:r>
+      <w:proofErr w:type="gramStart"/>
+      <w:r>
+        <w:t>trying</w:t>
+      </w:r>
+      <w:proofErr w:type="gramEnd"/>
+      <w:r>
+        <w:t xml:space="preserve"> to load it.</w:t>
+      </w:r>
+    </w:p>
+    <w:p>
+      <w:pPr>
+        <w:numPr>
+          <w:ilvl w:val="0"/>
+          <w:numId w:val="18"/>
+        </w:numPr>
+      </w:pPr>
+      <w:r>
+        <w:rPr>
+          <w:b/>
+          <w:bCs/>
+        </w:rPr>
+        <w:t>Low Maintenance:</w:t>
+      </w:r>
+      <w:r>
+        <w:t xml:space="preserve"> No CUDA driver conflicts, no GPU thermal throttling, and easy integration into standard IT environments.</w:t>
+      </w:r>
+    </w:p>
+    <w:p>
+      <w:r>
+        <w:t xml:space="preserve">This is a </w:t>
+      </w:r>
+      <w:r>
+        <w:rPr>
+          <w:b/>
+          <w:bCs/>
+        </w:rPr>
+        <w:t>6-Month Deployment Plan</w:t>
+      </w:r>
+      <w:r>
+        <w:t xml:space="preserve"> designed to get the lab fully operational for internal banking researchers.</w:t>
+      </w:r>
+    </w:p>
+    <w:p>
+      <w:pPr>
+        <w:rPr>
+          <w:b/>
+          <w:bCs/>
+        </w:rPr>
+      </w:pPr>
+      <w:r>
+        <w:rPr>
+          <w:b/>
+          <w:bCs/>
+        </w:rPr>
+        <w:t>Phase 1: Procurement, Assembly, &amp; Base Optimization (Month 1)</w:t>
+      </w:r>
+    </w:p>
+    <w:p>
+      <w:r>
+        <w:rPr>
+          <w:b/>
+          <w:bCs/>
+        </w:rPr>
+        <w:t>Objective:</w:t>
+      </w:r>
+      <w:r>
+        <w:t xml:space="preserve"> Procure the hardware, assemble the workstation, and configure the BIOS/OS for maximum memory bandwidth.</w:t>
+      </w:r>
+    </w:p>
+    <w:p>
+      <w:pPr>
+        <w:numPr>
+          <w:ilvl w:val="0"/>
+          <w:numId w:val="19"/>
+        </w:numPr>
+      </w:pPr>
+      <w:r>
+        <w:rPr>
+          <w:b/>
+          <w:bCs/>
+        </w:rPr>
+        <w:t>Week 1-2 (Procurement):</w:t>
+      </w:r>
+    </w:p>
+    <w:p>
+      <w:pPr>
+        <w:numPr>
+          <w:ilvl w:val="1"/>
+          <w:numId w:val="19"/>
+        </w:numPr>
+      </w:pPr>
+      <w:r>
+        <w:t xml:space="preserve">Order the AMD </w:t>
+      </w:r>
+      <w:proofErr w:type="spellStart"/>
+      <w:r>
+        <w:t>Ryzen</w:t>
+      </w:r>
+      <w:proofErr w:type="spellEnd"/>
+      <w:r>
         <w:t xml:space="preserve"> </w:t>
       </w:r>
-      <w:r>
-        <w:br/>
-      </w:r>
-    </w:p>
-    <w:p>
-      <w:pPr>
-        <w:rPr>
-          <w:b/>
-          <w:bCs/>
-        </w:rPr>
-      </w:pPr>
-      <w:r>
-        <w:rPr>
-          <w:b/>
-          <w:bCs/>
-        </w:rPr>
-        <w:t>SBI Life Insurance</w:t>
-      </w:r>
-    </w:p>
-    <w:p>
-      <w:r>
-        <w:t>Within the State Bank of India ecosystem, SBI Life deployed an internal platform called "</w:t>
-      </w:r>
       <w:proofErr w:type="spellStart"/>
       <w:r>
-        <w:t>InsightGenie</w:t>
+        <w:t>Threadripper</w:t>
       </w:r>
       <w:proofErr w:type="spellEnd"/>
       <w:r>
-        <w:t xml:space="preserve">". This is an AI-driven data insights platform explicitly built as a secure, on-premise solution. It allows their internal teams to access, </w:t>
+        <w:t xml:space="preserve"> PRO 7955WX (or EPYC equivalent) and the WRX90 motherboard.</w:t>
+      </w:r>
+    </w:p>
+    <w:p>
+      <w:pPr>
+        <w:numPr>
+          <w:ilvl w:val="1"/>
+          <w:numId w:val="19"/>
+        </w:numPr>
+      </w:pPr>
+      <w:r>
+        <w:rPr>
+          <w:i/>
+          <w:iCs/>
+        </w:rPr>
+        <w:t>Critical Step:</w:t>
+      </w:r>
+      <w:r>
+        <w:t xml:space="preserve"> Ensure you purchase </w:t>
+      </w:r>
+      <w:r>
+        <w:rPr>
+          <w:b/>
+          <w:bCs/>
+        </w:rPr>
+        <w:t>8 identical sticks of 32GB ECC DDR5 RAM</w:t>
+      </w:r>
+      <w:r>
+        <w:t>. If you only populate 4 channels, your memory bandwidth drops by half, and the AI will generate text at half the speed.</w:t>
+      </w:r>
+    </w:p>
+    <w:p>
+      <w:pPr>
+        <w:numPr>
+          <w:ilvl w:val="0"/>
+          <w:numId w:val="19"/>
+        </w:numPr>
+      </w:pPr>
+      <w:r>
+        <w:rPr>
+          <w:b/>
+          <w:bCs/>
+        </w:rPr>
+        <w:t>Week 3 (Assembly &amp; OS):</w:t>
+      </w:r>
+    </w:p>
+    <w:p>
+      <w:pPr>
+        <w:numPr>
+          <w:ilvl w:val="1"/>
+          <w:numId w:val="19"/>
+        </w:numPr>
+      </w:pPr>
+      <w:r>
+        <w:t>Assemble the hardware. Install Ubuntu 24.04 LTS.</w:t>
+      </w:r>
+    </w:p>
+    <w:p>
+      <w:pPr>
+        <w:numPr>
+          <w:ilvl w:val="1"/>
+          <w:numId w:val="19"/>
+        </w:numPr>
+      </w:pPr>
+      <w:r>
+        <w:t xml:space="preserve">Flash the latest BIOS. Enable </w:t>
+      </w:r>
+      <w:r>
+        <w:rPr>
+          <w:b/>
+          <w:bCs/>
+        </w:rPr>
+        <w:t>XMP/EXPO</w:t>
+      </w:r>
+      <w:r>
+        <w:t xml:space="preserve"> memory profiles in the BIOS to ensure the RAM runs at its maximum rated speed (e.g., 5600 MHz or 6000 MHz).</w:t>
+      </w:r>
+    </w:p>
+    <w:p>
+      <w:pPr>
+        <w:numPr>
+          <w:ilvl w:val="0"/>
+          <w:numId w:val="19"/>
+        </w:numPr>
+      </w:pPr>
+      <w:r>
+        <w:rPr>
+          <w:b/>
+          <w:bCs/>
+        </w:rPr>
+        <w:t>Week 4 (CPU Instruction Optimization):</w:t>
+      </w:r>
+    </w:p>
+    <w:p>
+      <w:pPr>
+        <w:numPr>
+          <w:ilvl w:val="1"/>
+          <w:numId w:val="19"/>
+        </w:numPr>
+      </w:pPr>
+      <w:r>
+        <w:lastRenderedPageBreak/>
+        <w:t xml:space="preserve">Verify that the OS is utilizing AVX-512 instructions (standard on modern </w:t>
       </w:r>
       <w:proofErr w:type="spellStart"/>
       <w:r>
-        <w:t>analyze</w:t>
+        <w:t>Threadripper</w:t>
       </w:r>
       <w:proofErr w:type="spellEnd"/>
       <w:r>
-        <w:t xml:space="preserve">, and query multi-layered proprietary performance data without exposing that financial telemetry to external cloud networks. </w:t>
+        <w:t xml:space="preserve">/EPYC chips). This is the mathematical instruction set that allows the CPU to process neural networks efficiently. </w:t>
+      </w:r>
+    </w:p>
+    <w:p>
+      <w:pPr>
+        <w:rPr>
+          <w:b/>
+          <w:bCs/>
+        </w:rPr>
+      </w:pPr>
+      <w:r>
+        <w:rPr>
+          <w:b/>
+          <w:bCs/>
+        </w:rPr>
+        <w:t>Phase 2: The Core AI Engine &amp; Model Acquisition (Month 2)</w:t>
+      </w:r>
+    </w:p>
+    <w:p>
+      <w:r>
+        <w:rPr>
+          <w:b/>
+          <w:bCs/>
+        </w:rPr>
+        <w:t>Objective:</w:t>
+      </w:r>
+      <w:r>
+        <w:t xml:space="preserve"> Install the CPU-optimized inference engines and build a local library of quantized models.</w:t>
+      </w:r>
+    </w:p>
+    <w:p>
+      <w:pPr>
+        <w:numPr>
+          <w:ilvl w:val="0"/>
+          <w:numId w:val="20"/>
+        </w:numPr>
+      </w:pPr>
+      <w:r>
+        <w:rPr>
+          <w:b/>
+          <w:bCs/>
+        </w:rPr>
+        <w:t xml:space="preserve">Week 1 (Installing </w:t>
+      </w:r>
+      <w:proofErr w:type="spellStart"/>
+      <w:r>
+        <w:rPr>
+          <w:b/>
+          <w:bCs/>
+        </w:rPr>
+        <w:t>Ollama</w:t>
+      </w:r>
+      <w:proofErr w:type="spellEnd"/>
+      <w:r>
+        <w:rPr>
+          <w:b/>
+          <w:bCs/>
+        </w:rPr>
+        <w:t xml:space="preserve"> &amp; llama.cpp):</w:t>
+      </w:r>
+    </w:p>
+    <w:p>
+      <w:pPr>
+        <w:numPr>
+          <w:ilvl w:val="1"/>
+          <w:numId w:val="20"/>
+        </w:numPr>
+      </w:pPr>
+      <w:r>
+        <w:t xml:space="preserve">Install </w:t>
+      </w:r>
+      <w:r>
+        <w:rPr>
+          <w:b/>
+          <w:bCs/>
+        </w:rPr>
+        <w:t>llama.cpp</w:t>
+      </w:r>
+      <w:r>
+        <w:t xml:space="preserve"> (the core engine written in C++ that treats transformer weights as memory-mapped data). </w:t>
+      </w:r>
+    </w:p>
+    <w:p>
+      <w:pPr>
+        <w:numPr>
+          <w:ilvl w:val="1"/>
+          <w:numId w:val="20"/>
+        </w:numPr>
+      </w:pPr>
+      <w:r>
+        <w:t xml:space="preserve">Install </w:t>
+      </w:r>
+      <w:proofErr w:type="spellStart"/>
+      <w:r>
+        <w:rPr>
+          <w:b/>
+          <w:bCs/>
+        </w:rPr>
+        <w:t>Ollama</w:t>
+      </w:r>
+      <w:proofErr w:type="spellEnd"/>
+      <w:r>
+        <w:t xml:space="preserve"> (which acts as a user-friendly wrapper over llama.cpp) to handle API endpoints and model management. </w:t>
+      </w:r>
+    </w:p>
+    <w:p>
+      <w:pPr>
+        <w:numPr>
+          <w:ilvl w:val="0"/>
+          <w:numId w:val="20"/>
+        </w:numPr>
+      </w:pPr>
+      <w:r>
+        <w:rPr>
+          <w:b/>
+          <w:bCs/>
+        </w:rPr>
+        <w:t>Week 2-3 (Sourcing GGUF Models):</w:t>
+      </w:r>
+    </w:p>
+    <w:p>
+      <w:pPr>
+        <w:numPr>
+          <w:ilvl w:val="1"/>
+          <w:numId w:val="20"/>
+        </w:numPr>
+      </w:pPr>
+      <w:r>
+        <w:t xml:space="preserve">GPU models use formats </w:t>
+      </w:r>
+      <w:proofErr w:type="gramStart"/>
+      <w:r>
+        <w:t>like .</w:t>
+      </w:r>
+      <w:proofErr w:type="spellStart"/>
+      <w:r>
+        <w:t>safetensors</w:t>
+      </w:r>
+      <w:proofErr w:type="spellEnd"/>
+      <w:proofErr w:type="gramEnd"/>
+      <w:r>
+        <w:t xml:space="preserve">. For CPUs, you </w:t>
+      </w:r>
+      <w:r>
+        <w:rPr>
+          <w:i/>
+          <w:iCs/>
+        </w:rPr>
+        <w:t>must</w:t>
+      </w:r>
+      <w:r>
+        <w:t xml:space="preserve"> use the </w:t>
+      </w:r>
+      <w:r>
+        <w:rPr>
+          <w:b/>
+          <w:bCs/>
+        </w:rPr>
+        <w:t>GGUF format</w:t>
+      </w:r>
+      <w:r>
+        <w:t xml:space="preserve">. </w:t>
+      </w:r>
+    </w:p>
+    <w:p>
+      <w:pPr>
+        <w:numPr>
+          <w:ilvl w:val="1"/>
+          <w:numId w:val="20"/>
+        </w:numPr>
+      </w:pPr>
+      <w:r>
+        <w:t>Download 4-bit and 8-bit quantized GGUF models from Hugging Face via an offline USB transfer.</w:t>
+      </w:r>
+    </w:p>
+    <w:p>
+      <w:pPr>
+        <w:numPr>
+          <w:ilvl w:val="1"/>
+          <w:numId w:val="20"/>
+        </w:numPr>
+      </w:pPr>
+      <w:r>
+        <w:rPr>
+          <w:b/>
+          <w:bCs/>
+        </w:rPr>
+        <w:t>Core Library:</w:t>
+      </w:r>
+      <w:r>
+        <w:t xml:space="preserve"> Llama-3.1 (8B), Qwen-2.5-Coder (32B), and a massive model like DeepSeek R1 </w:t>
+      </w:r>
+      <w:proofErr w:type="spellStart"/>
+      <w:r>
+        <w:t>Distill</w:t>
+      </w:r>
+      <w:proofErr w:type="spellEnd"/>
+      <w:r>
+        <w:t xml:space="preserve"> (70B) or Command R+ (104B).</w:t>
+      </w:r>
+    </w:p>
+    <w:p>
+      <w:pPr>
+        <w:numPr>
+          <w:ilvl w:val="0"/>
+          <w:numId w:val="20"/>
+        </w:numPr>
+      </w:pPr>
+      <w:r>
+        <w:rPr>
+          <w:b/>
+          <w:bCs/>
+        </w:rPr>
+        <w:t>Week 4 (Benchmarking):</w:t>
+      </w:r>
+    </w:p>
+    <w:p>
+      <w:pPr>
+        <w:numPr>
+          <w:ilvl w:val="1"/>
+          <w:numId w:val="20"/>
+        </w:numPr>
+      </w:pPr>
+      <w:r>
+        <w:t xml:space="preserve">Run stress tests. Ensure the 8B models generate at </w:t>
+      </w:r>
+      <w:r>
+        <w:rPr>
+          <w:b/>
+          <w:bCs/>
+        </w:rPr>
+        <w:t>30+ tokens/second</w:t>
+      </w:r>
+      <w:r>
+        <w:t xml:space="preserve"> and the 70B models generate at </w:t>
+      </w:r>
+      <w:r>
+        <w:rPr>
+          <w:b/>
+          <w:bCs/>
+        </w:rPr>
+        <w:t>4-6 tokens/second</w:t>
+      </w:r>
+      <w:r>
+        <w:t>.</w:t>
+      </w:r>
+    </w:p>
+    <w:p>
+      <w:pPr>
+        <w:rPr>
+          <w:b/>
+          <w:bCs/>
+        </w:rPr>
+      </w:pPr>
+      <w:r>
+        <w:rPr>
+          <w:b/>
+          <w:bCs/>
+        </w:rPr>
+        <w:t>Phase 3: Interface Deployment &amp; RAG Integration (Months 3-4)</w:t>
+      </w:r>
+    </w:p>
+    <w:p>
+      <w:r>
+        <w:rPr>
+          <w:b/>
+          <w:bCs/>
+        </w:rPr>
+        <w:t>Objective:</w:t>
+      </w:r>
+      <w:r>
+        <w:t xml:space="preserve"> Give the researcher a ChatGPT-like graphical interface and connect it to the bank's internal data.</w:t>
+      </w:r>
+    </w:p>
+    <w:p>
+      <w:pPr>
+        <w:numPr>
+          <w:ilvl w:val="0"/>
+          <w:numId w:val="21"/>
+        </w:numPr>
+      </w:pPr>
+      <w:r>
+        <w:rPr>
+          <w:b/>
+          <w:bCs/>
+        </w:rPr>
+        <w:t>Month 3 (The UI &amp; Environment):</w:t>
+      </w:r>
+    </w:p>
+    <w:p>
+      <w:pPr>
+        <w:numPr>
+          <w:ilvl w:val="1"/>
+          <w:numId w:val="21"/>
+        </w:numPr>
+      </w:pPr>
+      <w:r>
+        <w:t xml:space="preserve">Deploy </w:t>
+      </w:r>
+      <w:r>
+        <w:rPr>
+          <w:b/>
+          <w:bCs/>
+        </w:rPr>
+        <w:t xml:space="preserve">Open </w:t>
+      </w:r>
+      <w:proofErr w:type="spellStart"/>
+      <w:r>
+        <w:rPr>
+          <w:b/>
+          <w:bCs/>
+        </w:rPr>
+        <w:t>WebUI</w:t>
+      </w:r>
+      <w:proofErr w:type="spellEnd"/>
+      <w:r>
+        <w:t xml:space="preserve"> using Docker. Connect it to the local </w:t>
+      </w:r>
+      <w:proofErr w:type="spellStart"/>
+      <w:r>
+        <w:t>Ollama</w:t>
+      </w:r>
+      <w:proofErr w:type="spellEnd"/>
+      <w:r>
+        <w:t xml:space="preserve"> API.</w:t>
+      </w:r>
+    </w:p>
+    <w:p>
+      <w:pPr>
+        <w:numPr>
+          <w:ilvl w:val="1"/>
+          <w:numId w:val="21"/>
+        </w:numPr>
+      </w:pPr>
+      <w:r>
+        <w:t>Set up user accounts so the researcher can access the system securely from their standard corporate laptop via the internal network.</w:t>
+      </w:r>
+    </w:p>
+    <w:p>
+      <w:pPr>
+        <w:numPr>
+          <w:ilvl w:val="1"/>
+          <w:numId w:val="21"/>
+        </w:numPr>
+      </w:pPr>
+      <w:r>
+        <w:t>Create custom "System Prompts" in the UI (e.g., configuring one chat window to act as a "Senior Financial Auditor" and another as a "Python Developer").</w:t>
+      </w:r>
+    </w:p>
+    <w:p>
+      <w:pPr>
+        <w:numPr>
+          <w:ilvl w:val="0"/>
+          <w:numId w:val="21"/>
+        </w:numPr>
+      </w:pPr>
+      <w:r>
+        <w:rPr>
+          <w:b/>
+          <w:bCs/>
+        </w:rPr>
+        <w:t>Month 4 (Vector Database &amp; RAG):</w:t>
+      </w:r>
+    </w:p>
+    <w:p>
+      <w:pPr>
+        <w:numPr>
+          <w:ilvl w:val="1"/>
+          <w:numId w:val="21"/>
+        </w:numPr>
+      </w:pPr>
+      <w:r>
+        <w:t xml:space="preserve">Install a local Vector Database (e.g., </w:t>
+      </w:r>
+      <w:proofErr w:type="spellStart"/>
+      <w:r>
+        <w:t>ChromaDB</w:t>
+      </w:r>
+      <w:proofErr w:type="spellEnd"/>
+      <w:r>
+        <w:t xml:space="preserve"> or </w:t>
+      </w:r>
+      <w:proofErr w:type="spellStart"/>
+      <w:r>
+        <w:t>Qdrant</w:t>
+      </w:r>
+      <w:proofErr w:type="spellEnd"/>
+      <w:r>
+        <w:t>).</w:t>
+      </w:r>
+    </w:p>
+    <w:p>
+      <w:pPr>
+        <w:numPr>
+          <w:ilvl w:val="1"/>
+          <w:numId w:val="21"/>
+        </w:numPr>
+      </w:pPr>
+      <w:r>
+        <w:lastRenderedPageBreak/>
+        <w:t xml:space="preserve">Use a CPU-friendly embedding model (like nomic-embed-text) to ingest the bank's research documents, RBI circulars, and JSON data. </w:t>
+      </w:r>
+    </w:p>
+    <w:p>
+      <w:pPr>
+        <w:numPr>
+          <w:ilvl w:val="1"/>
+          <w:numId w:val="21"/>
+        </w:numPr>
+      </w:pPr>
+      <w:r>
+        <w:t xml:space="preserve">Connect Open </w:t>
+      </w:r>
+      <w:proofErr w:type="spellStart"/>
+      <w:r>
+        <w:t>WebUI</w:t>
+      </w:r>
+      <w:proofErr w:type="spellEnd"/>
+      <w:r>
+        <w:t xml:space="preserve"> to </w:t>
+      </w:r>
+      <w:proofErr w:type="spellStart"/>
+      <w:r>
+        <w:t>ChromaDB</w:t>
+      </w:r>
+      <w:proofErr w:type="spellEnd"/>
+      <w:r>
+        <w:t>. The researcher can now type "@documents" in the chat to force the AI to read the internal files before answering.</w:t>
+      </w:r>
+    </w:p>
+    <w:p>
+      <w:pPr>
+        <w:rPr>
+          <w:b/>
+          <w:bCs/>
+        </w:rPr>
+      </w:pPr>
+      <w:r>
+        <w:rPr>
+          <w:b/>
+          <w:bCs/>
+        </w:rPr>
+        <w:t>Phase 4: Researcher Onboarding &amp; Advanced Batching (Months 5-6)</w:t>
+      </w:r>
+    </w:p>
+    <w:p>
+      <w:r>
+        <w:rPr>
+          <w:b/>
+          <w:bCs/>
+        </w:rPr>
+        <w:t>Objective:</w:t>
+      </w:r>
+      <w:r>
+        <w:t xml:space="preserve"> Train the researcher on latency expectations and set up automated, long-running background tasks.</w:t>
+      </w:r>
+    </w:p>
+    <w:p>
+      <w:pPr>
+        <w:numPr>
+          <w:ilvl w:val="0"/>
+          <w:numId w:val="22"/>
+        </w:numPr>
+      </w:pPr>
+      <w:r>
+        <w:rPr>
+          <w:b/>
+          <w:bCs/>
+        </w:rPr>
+        <w:t>Month 5 (Workflow Adaptation):</w:t>
+      </w:r>
+    </w:p>
+    <w:p>
+      <w:pPr>
+        <w:numPr>
+          <w:ilvl w:val="1"/>
+          <w:numId w:val="22"/>
+        </w:numPr>
+      </w:pPr>
+      <w:r>
+        <w:rPr>
+          <w:b/>
+          <w:bCs/>
+        </w:rPr>
+        <w:t>Live Chat Training:</w:t>
+      </w:r>
+      <w:r>
+        <w:t xml:space="preserve"> Train the researcher to use the smaller 8B–14B models for fast, real-time brainstorming and code-autocomplete.</w:t>
+      </w:r>
+    </w:p>
+    <w:p>
+      <w:pPr>
+        <w:numPr>
+          <w:ilvl w:val="1"/>
+          <w:numId w:val="22"/>
+        </w:numPr>
+      </w:pPr>
+      <w:r>
+        <w:rPr>
+          <w:b/>
+          <w:bCs/>
+        </w:rPr>
+        <w:t>Deep Research Training:</w:t>
+      </w:r>
+      <w:r>
+        <w:t xml:space="preserve"> Train the researcher to load the massive 70B+ models for deep reasoning. Manage expectations: they will watch the text appear slowly (a few words a second), but the logic will be flawless.</w:t>
+      </w:r>
+    </w:p>
+    <w:p>
+      <w:pPr>
+        <w:numPr>
+          <w:ilvl w:val="0"/>
+          <w:numId w:val="22"/>
+        </w:numPr>
+      </w:pPr>
+      <w:r>
+        <w:rPr>
+          <w:b/>
+          <w:bCs/>
+        </w:rPr>
+        <w:t>Month 6 (Asynchronous Batch Workflows):</w:t>
+      </w:r>
+    </w:p>
+    <w:p>
+      <w:pPr>
+        <w:numPr>
+          <w:ilvl w:val="1"/>
+          <w:numId w:val="22"/>
+        </w:numPr>
+      </w:pPr>
+      <w:r>
+        <w:t>The true power of 256GB of RAM is running massive models overnight.</w:t>
+      </w:r>
+    </w:p>
+    <w:p>
+      <w:pPr>
+        <w:numPr>
+          <w:ilvl w:val="1"/>
+          <w:numId w:val="22"/>
+        </w:numPr>
+      </w:pPr>
+      <w:r>
+        <w:t>Work with the researcher to write Python scripts using the llama.cpp OpenAI-compatible REST API.</w:t>
+      </w:r>
+    </w:p>
+    <w:p>
+      <w:pPr>
+        <w:numPr>
+          <w:ilvl w:val="1"/>
+          <w:numId w:val="22"/>
+        </w:numPr>
+      </w:pPr>
+      <w:r>
+        <w:rPr>
+          <w:b/>
+          <w:bCs/>
+        </w:rPr>
+        <w:t>Example Task:</w:t>
+      </w:r>
+      <w:r>
+        <w:t xml:space="preserve"> A script that feeds 1,000 anonymized loan defaults into a 70B model. The CPU crunches this sequentially over the weekend, generating a highly detailed risk-factor report by Monday morning without costing a single API token.</w:t>
+      </w:r>
+    </w:p>
+    <w:p>
+      <w:pPr>
+        <w:rPr>
+          <w:b/>
+          <w:bCs/>
+        </w:rPr>
+      </w:pPr>
+      <w:r>
+        <w:rPr>
+          <w:b/>
+          <w:bCs/>
+        </w:rPr>
+        <w:t>Key Milestone Checklist</w:t>
+      </w:r>
+    </w:p>
+    <w:p>
+      <w:r>
+        <w:t>At the end of Month 6, the project is considered successful if it meets these criteria:</w:t>
+      </w:r>
+    </w:p>
+    <w:p>
+      <w:pPr>
+        <w:numPr>
+          <w:ilvl w:val="0"/>
+          <w:numId w:val="23"/>
+        </w:numPr>
+      </w:pPr>
+      <w:r>
+        <w:rPr>
+          <w:b/>
+          <w:bCs/>
+        </w:rPr>
+        <w:t>Zero External API Calls:</w:t>
+      </w:r>
+      <w:r>
+        <w:t xml:space="preserve"> 100% of the researcher's LLM workloads are running entirely offline.</w:t>
+      </w:r>
+    </w:p>
+    <w:p>
+      <w:pPr>
+        <w:numPr>
+          <w:ilvl w:val="0"/>
+          <w:numId w:val="23"/>
+        </w:numPr>
+      </w:pPr>
+      <w:r>
+        <w:rPr>
+          <w:b/>
+          <w:bCs/>
+        </w:rPr>
+        <w:t>Model Flexibility:</w:t>
+      </w:r>
+      <w:r>
+        <w:t xml:space="preserve"> The researcher has successfully loaded and queried at least one model exceeding 70 </w:t>
+      </w:r>
+      <w:proofErr w:type="gramStart"/>
+      <w:r>
+        <w:t>Billion</w:t>
+      </w:r>
+      <w:proofErr w:type="gramEnd"/>
+      <w:r>
+        <w:t xml:space="preserve"> parameters (which would be impossible on standard hardware without expensive GPUs).</w:t>
+      </w:r>
+    </w:p>
+    <w:p>
+      <w:pPr>
+        <w:numPr>
+          <w:ilvl w:val="0"/>
+          <w:numId w:val="23"/>
+        </w:numPr>
+      </w:pPr>
+      <w:r>
+        <w:rPr>
+          <w:b/>
+          <w:bCs/>
+        </w:rPr>
+        <w:t>Data Security:</w:t>
+      </w:r>
+      <w:r>
+        <w:t xml:space="preserve"> InfoSec verifies that the workstation is successfully isolated on a VLAN with no outbound internet traffic, while still serving the internal </w:t>
+      </w:r>
+      <w:proofErr w:type="spellStart"/>
+      <w:r>
+        <w:t>WebUI</w:t>
+      </w:r>
+      <w:proofErr w:type="spellEnd"/>
+      <w:r>
+        <w:t>.</w:t>
       </w:r>
     </w:p>
     <w:p/>
-    <w:p>
-      <w:pPr>
-        <w:rPr>
-          <w:b/>
-          <w:bCs/>
-        </w:rPr>
-      </w:pPr>
-      <w:r>
-        <w:rPr>
-          <w:b/>
-          <w:bCs/>
-        </w:rPr>
-        <w:t>MUFG (Mitsubishi UFJ Financial Group)</w:t>
-      </w:r>
-    </w:p>
-    <w:p>
-      <w:r>
-        <w:t xml:space="preserve">MUFG has deployed on-premise, air-gapped AI workflows specifically designed for core banking compliance. By using localized platforms, they can run deterministic AI tasks—like KYC document processing, AML (Anti-Money Laundering) checks, and loan underwriting automation—ensuring that highly sensitive customer identification data never leaves the </w:t>
-      </w:r>
-      <w:proofErr w:type="gramStart"/>
-      <w:r>
-        <w:t>bank's controlled</w:t>
-      </w:r>
-      <w:proofErr w:type="gramEnd"/>
-      <w:r>
-        <w:t xml:space="preserve"> infrastructure.</w:t>
-      </w:r>
-    </w:p>
+    <w:p/>
     <w:p/>
     <w:sectPr>
       <w:pgSz w:w="11906" w:h="16838"/>
@@ -3577,9 +5582,172 @@
 </w:document>
 </file>
 
+<file path=word/endnotes.xml><?xml version="1.0" encoding="utf-8"?>
+<w:endnotes xmlns:wpc="http://schemas.microsoft.com/office/word/2010/wordprocessingCanvas" xmlns:cx="http://schemas.microsoft.com/office/drawing/2014/chartex" xmlns:cx1="http://schemas.microsoft.com/office/drawing/2015/9/8/chartex" xmlns:cx2="http://schemas.microsoft.com/office/drawing/2015/10/21/chartex" xmlns:cx3="http://schemas.microsoft.com/office/drawing/2016/5/9/chartex" xmlns:cx4="http://schemas.microsoft.com/office/drawing/2016/5/10/chartex" xmlns:cx5="http://schemas.microsoft.com/office/drawing/2016/5/11/chartex" xmlns:cx6="http://schemas.microsoft.com/office/drawing/2016/5/12/chartex" xmlns:cx7="http://schemas.microsoft.com/office/drawing/2016/5/13/chartex" xmlns:cx8="http://schemas.microsoft.com/office/drawing/2016/5/14/chartex" xmlns:mc="http://schemas.openxmlformats.org/markup-compatibility/2006" xmlns:aink="http://schemas.microsoft.com/office/drawing/2016/ink" xmlns:am3d="http://schemas.microsoft.com/office/drawing/2017/model3d" xmlns:o="urn:schemas-microsoft-com:office:office" xmlns:oel="http://schemas.microsoft.com/office/2019/extlst" xmlns:r="http://schemas.openxmlformats.org/officeDocument/2006/relationships" xmlns:m="http://schemas.openxmlformats.org/officeDocument/2006/math" xmlns:v="urn:schemas-microsoft-com:vml" xmlns:wp14="http://schemas.microsoft.com/office/word/2010/wordprocessingDrawing" xmlns:wp="http://schemas.openxmlformats.org/drawingml/2006/wordprocessingDrawing" xmlns:w10="urn:schemas-microsoft-com:office:word" xmlns:w="http://schemas.openxmlformats.org/wordprocessingml/2006/main" xmlns:w14="http://schemas.microsoft.com/office/word/2010/wordml" xmlns:w15="http://schemas.microsoft.com/office/word/2012/wordml" xmlns:w16cex="http://schemas.microsoft.com/office/word/2018/wordml/cex" xmlns:w16cid="http://schemas.microsoft.com/office/word/2016/wordml/cid" xmlns:w16="http://schemas.microsoft.com/office/word/2018/wordml" xmlns:w16du="http://schemas.microsoft.com/office/word/2023/wordml/word16du" xmlns:w16sdtdh="http://schemas.microsoft.com/office/word/2020/wordml/sdtdatahash" xmlns:w16sdtfl="http://schemas.microsoft.com/office/word/2024/wordml/sdtformatlock" xmlns:w16se="http://schemas.microsoft.com/office/word/2015/wordml/symex" xmlns:wpg="http://schemas.microsoft.com/office/word/2010/wordprocessingGroup" xmlns:wpi="http://schemas.microsoft.com/office/word/2010/wordprocessingInk" xmlns:wne="http://schemas.microsoft.com/office/word/2006/wordml" xmlns:wps="http://schemas.microsoft.com/office/word/2010/wordprocessingShape" mc:Ignorable="w14 w15 w16se w16cid w16 w16cex w16sdtdh w16sdtfl w16du wp14">
+  <w:endnote w:type="separator" w:id="-1">
+    <w:p>
+      <w:pPr>
+        <w:spacing w:after="0" w:line="240" w:lineRule="auto"/>
+      </w:pPr>
+      <w:r>
+        <w:separator/>
+      </w:r>
+    </w:p>
+  </w:endnote>
+  <w:endnote w:type="continuationSeparator" w:id="0">
+    <w:p>
+      <w:pPr>
+        <w:spacing w:after="0" w:line="240" w:lineRule="auto"/>
+      </w:pPr>
+      <w:r>
+        <w:continuationSeparator/>
+      </w:r>
+    </w:p>
+  </w:endnote>
+</w:endnotes>
+</file>
+
+<file path=word/footnotes.xml><?xml version="1.0" encoding="utf-8"?>
+<w:footnotes xmlns:wpc="http://schemas.microsoft.com/office/word/2010/wordprocessingCanvas" xmlns:cx="http://schemas.microsoft.com/office/drawing/2014/chartex" xmlns:cx1="http://schemas.microsoft.com/office/drawing/2015/9/8/chartex" xmlns:cx2="http://schemas.microsoft.com/office/drawing/2015/10/21/chartex" xmlns:cx3="http://schemas.microsoft.com/office/drawing/2016/5/9/chartex" xmlns:cx4="http://schemas.microsoft.com/office/drawing/2016/5/10/chartex" xmlns:cx5="http://schemas.microsoft.com/office/drawing/2016/5/11/chartex" xmlns:cx6="http://schemas.microsoft.com/office/drawing/2016/5/12/chartex" xmlns:cx7="http://schemas.microsoft.com/office/drawing/2016/5/13/chartex" xmlns:cx8="http://schemas.microsoft.com/office/drawing/2016/5/14/chartex" xmlns:mc="http://schemas.openxmlformats.org/markup-compatibility/2006" xmlns:aink="http://schemas.microsoft.com/office/drawing/2016/ink" xmlns:am3d="http://schemas.microsoft.com/office/drawing/2017/model3d" xmlns:o="urn:schemas-microsoft-com:office:office" xmlns:oel="http://schemas.microsoft.com/office/2019/extlst" xmlns:r="http://schemas.openxmlformats.org/officeDocument/2006/relationships" xmlns:m="http://schemas.openxmlformats.org/officeDocument/2006/math" xmlns:v="urn:schemas-microsoft-com:vml" xmlns:wp14="http://schemas.microsoft.com/office/word/2010/wordprocessingDrawing" xmlns:wp="http://schemas.openxmlformats.org/drawingml/2006/wordprocessingDrawing" xmlns:w10="urn:schemas-microsoft-com:office:word" xmlns:w="http://schemas.openxmlformats.org/wordprocessingml/2006/main" xmlns:w14="http://schemas.microsoft.com/office/word/2010/wordml" xmlns:w15="http://schemas.microsoft.com/office/word/2012/wordml" xmlns:w16cex="http://schemas.microsoft.com/office/word/2018/wordml/cex" xmlns:w16cid="http://schemas.microsoft.com/office/word/2016/wordml/cid" xmlns:w16="http://schemas.microsoft.com/office/word/2018/wordml" xmlns:w16du="http://schemas.microsoft.com/office/word/2023/wordml/word16du" xmlns:w16sdtdh="http://schemas.microsoft.com/office/word/2020/wordml/sdtdatahash" xmlns:w16sdtfl="http://schemas.microsoft.com/office/word/2024/wordml/sdtformatlock" xmlns:w16se="http://schemas.microsoft.com/office/word/2015/wordml/symex" xmlns:wpg="http://schemas.microsoft.com/office/word/2010/wordprocessingGroup" xmlns:wpi="http://schemas.microsoft.com/office/word/2010/wordprocessingInk" xmlns:wne="http://schemas.microsoft.com/office/word/2006/wordml" xmlns:wps="http://schemas.microsoft.com/office/word/2010/wordprocessingShape" mc:Ignorable="w14 w15 w16se w16cid w16 w16cex w16sdtdh w16sdtfl w16du wp14">
+  <w:footnote w:type="separator" w:id="-1">
+    <w:p>
+      <w:pPr>
+        <w:spacing w:after="0" w:line="240" w:lineRule="auto"/>
+      </w:pPr>
+      <w:r>
+        <w:separator/>
+      </w:r>
+    </w:p>
+  </w:footnote>
+  <w:footnote w:type="continuationSeparator" w:id="0">
+    <w:p>
+      <w:pPr>
+        <w:spacing w:after="0" w:line="240" w:lineRule="auto"/>
+      </w:pPr>
+      <w:r>
+        <w:continuationSeparator/>
+      </w:r>
+    </w:p>
+  </w:footnote>
+</w:footnotes>
+</file>
+
 <file path=word/numbering.xml><?xml version="1.0" encoding="utf-8"?>
 <w:numbering xmlns:wpc="http://schemas.microsoft.com/office/word/2010/wordprocessingCanvas" xmlns:cx="http://schemas.microsoft.com/office/drawing/2014/chartex" xmlns:cx1="http://schemas.microsoft.com/office/drawing/2015/9/8/chartex" xmlns:cx2="http://schemas.microsoft.com/office/drawing/2015/10/21/chartex" xmlns:cx3="http://schemas.microsoft.com/office/drawing/2016/5/9/chartex" xmlns:cx4="http://schemas.microsoft.com/office/drawing/2016/5/10/chartex" xmlns:cx5="http://schemas.microsoft.com/office/drawing/2016/5/11/chartex" xmlns:cx6="http://schemas.microsoft.com/office/drawing/2016/5/12/chartex" xmlns:cx7="http://schemas.microsoft.com/office/drawing/2016/5/13/chartex" xmlns:cx8="http://schemas.microsoft.com/office/drawing/2016/5/14/chartex" xmlns:mc="http://schemas.openxmlformats.org/markup-compatibility/2006" xmlns:aink="http://schemas.microsoft.com/office/drawing/2016/ink" xmlns:am3d="http://schemas.microsoft.com/office/drawing/2017/model3d" xmlns:o="urn:schemas-microsoft-com:office:office" xmlns:oel="http://schemas.microsoft.com/office/2019/extlst" xmlns:r="http://schemas.openxmlformats.org/officeDocument/2006/relationships" xmlns:m="http://schemas.openxmlformats.org/officeDocument/2006/math" xmlns:v="urn:schemas-microsoft-com:vml" xmlns:wp14="http://schemas.microsoft.com/office/word/2010/wordprocessingDrawing" xmlns:wp="http://schemas.openxmlformats.org/drawingml/2006/wordprocessingDrawing" xmlns:w10="urn:schemas-microsoft-com:office:word" xmlns:w="http://schemas.openxmlformats.org/wordprocessingml/2006/main" xmlns:w14="http://schemas.microsoft.com/office/word/2010/wordml" xmlns:w15="http://schemas.microsoft.com/office/word/2012/wordml" xmlns:w16cex="http://schemas.microsoft.com/office/word/2018/wordml/cex" xmlns:w16cid="http://schemas.microsoft.com/office/word/2016/wordml/cid" xmlns:w16="http://schemas.microsoft.com/office/word/2018/wordml" xmlns:w16du="http://schemas.microsoft.com/office/word/2023/wordml/word16du" xmlns:w16sdtdh="http://schemas.microsoft.com/office/word/2020/wordml/sdtdatahash" xmlns:w16sdtfl="http://schemas.microsoft.com/office/word/2024/wordml/sdtformatlock" xmlns:w16se="http://schemas.microsoft.com/office/word/2015/wordml/symex" xmlns:wpg="http://schemas.microsoft.com/office/word/2010/wordprocessingGroup" xmlns:wpi="http://schemas.microsoft.com/office/word/2010/wordprocessingInk" xmlns:wne="http://schemas.microsoft.com/office/word/2006/wordml" xmlns:wps="http://schemas.microsoft.com/office/word/2010/wordprocessingShape" mc:Ignorable="w14 w15 w16se w16cid w16 w16cex w16sdtdh w16sdtfl w16du wp14">
   <w:abstractNum w:abstractNumId="0" w15:restartNumberingAfterBreak="0">
+    <w:nsid w:val="0008610E"/>
+    <w:multiLevelType w:val="multilevel"/>
+    <w:tmpl w:val="4D2C2288"/>
+    <w:lvl w:ilvl="0">
+      <w:start w:val="1"/>
+      <w:numFmt w:val="decimal"/>
+      <w:lvlText w:val="%1."/>
+      <w:lvlJc w:val="left"/>
+      <w:pPr>
+        <w:tabs>
+          <w:tab w:val="num" w:pos="720"/>
+        </w:tabs>
+        <w:ind w:left="720" w:hanging="360"/>
+      </w:pPr>
+    </w:lvl>
+    <w:lvl w:ilvl="1" w:tentative="1">
+      <w:start w:val="1"/>
+      <w:numFmt w:val="decimal"/>
+      <w:lvlText w:val="%2."/>
+      <w:lvlJc w:val="left"/>
+      <w:pPr>
+        <w:tabs>
+          <w:tab w:val="num" w:pos="1440"/>
+        </w:tabs>
+        <w:ind w:left="1440" w:hanging="360"/>
+      </w:pPr>
+    </w:lvl>
+    <w:lvl w:ilvl="2" w:tentative="1">
+      <w:start w:val="1"/>
+      <w:numFmt w:val="decimal"/>
+      <w:lvlText w:val="%3."/>
+      <w:lvlJc w:val="left"/>
+      <w:pPr>
+        <w:tabs>
+          <w:tab w:val="num" w:pos="2160"/>
+        </w:tabs>
+        <w:ind w:left="2160" w:hanging="360"/>
+      </w:pPr>
+    </w:lvl>
+    <w:lvl w:ilvl="3" w:tentative="1">
+      <w:start w:val="1"/>
+      <w:numFmt w:val="decimal"/>
+      <w:lvlText w:val="%4."/>
+      <w:lvlJc w:val="left"/>
+      <w:pPr>
+        <w:tabs>
+          <w:tab w:val="num" w:pos="2880"/>
+        </w:tabs>
+        <w:ind w:left="2880" w:hanging="360"/>
+      </w:pPr>
+    </w:lvl>
+    <w:lvl w:ilvl="4" w:tentative="1">
+      <w:start w:val="1"/>
+      <w:numFmt w:val="decimal"/>
+      <w:lvlText w:val="%5."/>
+      <w:lvlJc w:val="left"/>
+      <w:pPr>
+        <w:tabs>
+          <w:tab w:val="num" w:pos="3600"/>
+        </w:tabs>
+        <w:ind w:left="3600" w:hanging="360"/>
+      </w:pPr>
+    </w:lvl>
+    <w:lvl w:ilvl="5" w:tentative="1">
+      <w:start w:val="1"/>
+      <w:numFmt w:val="decimal"/>
+      <w:lvlText w:val="%6."/>
+      <w:lvlJc w:val="left"/>
+      <w:pPr>
+        <w:tabs>
+          <w:tab w:val="num" w:pos="4320"/>
+        </w:tabs>
+        <w:ind w:left="4320" w:hanging="360"/>
+      </w:pPr>
+    </w:lvl>
+    <w:lvl w:ilvl="6" w:tentative="1">
+      <w:start w:val="1"/>
+      <w:numFmt w:val="decimal"/>
+      <w:lvlText w:val="%7."/>
+      <w:lvlJc w:val="left"/>
+      <w:pPr>
+        <w:tabs>
+          <w:tab w:val="num" w:pos="5040"/>
+        </w:tabs>
+        <w:ind w:left="5040" w:hanging="360"/>
+      </w:pPr>
+    </w:lvl>
+    <w:lvl w:ilvl="7" w:tentative="1">
+      <w:start w:val="1"/>
+      <w:numFmt w:val="decimal"/>
+      <w:lvlText w:val="%8."/>
+      <w:lvlJc w:val="left"/>
+      <w:pPr>
+        <w:tabs>
+          <w:tab w:val="num" w:pos="5760"/>
+        </w:tabs>
+        <w:ind w:left="5760" w:hanging="360"/>
+      </w:pPr>
+    </w:lvl>
+    <w:lvl w:ilvl="8" w:tentative="1">
+      <w:start w:val="1"/>
+      <w:numFmt w:val="decimal"/>
+      <w:lvlText w:val="%9."/>
+      <w:lvlJc w:val="left"/>
+      <w:pPr>
+        <w:tabs>
+          <w:tab w:val="num" w:pos="6480"/>
+        </w:tabs>
+        <w:ind w:left="6480" w:hanging="360"/>
+      </w:pPr>
+    </w:lvl>
+  </w:abstractNum>
+  <w:abstractNum w:abstractNumId="1" w15:restartNumberingAfterBreak="0">
     <w:nsid w:val="028555F0"/>
     <w:multiLevelType w:val="multilevel"/>
     <w:tmpl w:val="5C686DD4"/>
@@ -3728,7 +5896,7 @@
       </w:rPr>
     </w:lvl>
   </w:abstractNum>
-  <w:abstractNum w:abstractNumId="1" w15:restartNumberingAfterBreak="0">
+  <w:abstractNum w:abstractNumId="2" w15:restartNumberingAfterBreak="0">
     <w:nsid w:val="069E001F"/>
     <w:multiLevelType w:val="multilevel"/>
     <w:tmpl w:val="C1CAFEB4"/>
@@ -3877,7 +6045,156 @@
       </w:rPr>
     </w:lvl>
   </w:abstractNum>
-  <w:abstractNum w:abstractNumId="2" w15:restartNumberingAfterBreak="0">
+  <w:abstractNum w:abstractNumId="3" w15:restartNumberingAfterBreak="0">
+    <w:nsid w:val="06AB77A3"/>
+    <w:multiLevelType w:val="multilevel"/>
+    <w:tmpl w:val="EE5A9578"/>
+    <w:lvl w:ilvl="0">
+      <w:start w:val="1"/>
+      <w:numFmt w:val="bullet"/>
+      <w:lvlText w:val=""/>
+      <w:lvlJc w:val="left"/>
+      <w:pPr>
+        <w:tabs>
+          <w:tab w:val="num" w:pos="720"/>
+        </w:tabs>
+        <w:ind w:left="720" w:hanging="360"/>
+      </w:pPr>
+      <w:rPr>
+        <w:rFonts w:ascii="Symbol" w:hAnsi="Symbol" w:hint="default"/>
+        <w:sz w:val="20"/>
+      </w:rPr>
+    </w:lvl>
+    <w:lvl w:ilvl="1">
+      <w:start w:val="1"/>
+      <w:numFmt w:val="bullet"/>
+      <w:lvlText w:val="o"/>
+      <w:lvlJc w:val="left"/>
+      <w:pPr>
+        <w:tabs>
+          <w:tab w:val="num" w:pos="1440"/>
+        </w:tabs>
+        <w:ind w:left="1440" w:hanging="360"/>
+      </w:pPr>
+      <w:rPr>
+        <w:rFonts w:ascii="Courier New" w:hAnsi="Courier New" w:hint="default"/>
+        <w:sz w:val="20"/>
+      </w:rPr>
+    </w:lvl>
+    <w:lvl w:ilvl="2" w:tentative="1">
+      <w:start w:val="1"/>
+      <w:numFmt w:val="bullet"/>
+      <w:lvlText w:val=""/>
+      <w:lvlJc w:val="left"/>
+      <w:pPr>
+        <w:tabs>
+          <w:tab w:val="num" w:pos="2160"/>
+        </w:tabs>
+        <w:ind w:left="2160" w:hanging="360"/>
+      </w:pPr>
+      <w:rPr>
+        <w:rFonts w:ascii="Wingdings" w:hAnsi="Wingdings" w:hint="default"/>
+        <w:sz w:val="20"/>
+      </w:rPr>
+    </w:lvl>
+    <w:lvl w:ilvl="3" w:tentative="1">
+      <w:start w:val="1"/>
+      <w:numFmt w:val="bullet"/>
+      <w:lvlText w:val=""/>
+      <w:lvlJc w:val="left"/>
+      <w:pPr>
+        <w:tabs>
+          <w:tab w:val="num" w:pos="2880"/>
+        </w:tabs>
+        <w:ind w:left="2880" w:hanging="360"/>
+      </w:pPr>
+      <w:rPr>
+        <w:rFonts w:ascii="Wingdings" w:hAnsi="Wingdings" w:hint="default"/>
+        <w:sz w:val="20"/>
+      </w:rPr>
+    </w:lvl>
+    <w:lvl w:ilvl="4" w:tentative="1">
+      <w:start w:val="1"/>
+      <w:numFmt w:val="bullet"/>
+      <w:lvlText w:val=""/>
+      <w:lvlJc w:val="left"/>
+      <w:pPr>
+        <w:tabs>
+          <w:tab w:val="num" w:pos="3600"/>
+        </w:tabs>
+        <w:ind w:left="3600" w:hanging="360"/>
+      </w:pPr>
+      <w:rPr>
+        <w:rFonts w:ascii="Wingdings" w:hAnsi="Wingdings" w:hint="default"/>
+        <w:sz w:val="20"/>
+      </w:rPr>
+    </w:lvl>
+    <w:lvl w:ilvl="5" w:tentative="1">
+      <w:start w:val="1"/>
+      <w:numFmt w:val="bullet"/>
+      <w:lvlText w:val=""/>
+      <w:lvlJc w:val="left"/>
+      <w:pPr>
+        <w:tabs>
+          <w:tab w:val="num" w:pos="4320"/>
+        </w:tabs>
+        <w:ind w:left="4320" w:hanging="360"/>
+      </w:pPr>
+      <w:rPr>
+        <w:rFonts w:ascii="Wingdings" w:hAnsi="Wingdings" w:hint="default"/>
+        <w:sz w:val="20"/>
+      </w:rPr>
+    </w:lvl>
+    <w:lvl w:ilvl="6" w:tentative="1">
+      <w:start w:val="1"/>
+      <w:numFmt w:val="bullet"/>
+      <w:lvlText w:val=""/>
+      <w:lvlJc w:val="left"/>
+      <w:pPr>
+        <w:tabs>
+          <w:tab w:val="num" w:pos="5040"/>
+        </w:tabs>
+        <w:ind w:left="5040" w:hanging="360"/>
+      </w:pPr>
+      <w:rPr>
+        <w:rFonts w:ascii="Wingdings" w:hAnsi="Wingdings" w:hint="default"/>
+        <w:sz w:val="20"/>
+      </w:rPr>
+    </w:lvl>
+    <w:lvl w:ilvl="7" w:tentative="1">
+      <w:start w:val="1"/>
+      <w:numFmt w:val="bullet"/>
+      <w:lvlText w:val=""/>
+      <w:lvlJc w:val="left"/>
+      <w:pPr>
+        <w:tabs>
+          <w:tab w:val="num" w:pos="5760"/>
+        </w:tabs>
+        <w:ind w:left="5760" w:hanging="360"/>
+      </w:pPr>
+      <w:rPr>
+        <w:rFonts w:ascii="Wingdings" w:hAnsi="Wingdings" w:hint="default"/>
+        <w:sz w:val="20"/>
+      </w:rPr>
+    </w:lvl>
+    <w:lvl w:ilvl="8" w:tentative="1">
+      <w:start w:val="1"/>
+      <w:numFmt w:val="bullet"/>
+      <w:lvlText w:val=""/>
+      <w:lvlJc w:val="left"/>
+      <w:pPr>
+        <w:tabs>
+          <w:tab w:val="num" w:pos="6480"/>
+        </w:tabs>
+        <w:ind w:left="6480" w:hanging="360"/>
+      </w:pPr>
+      <w:rPr>
+        <w:rFonts w:ascii="Wingdings" w:hAnsi="Wingdings" w:hint="default"/>
+        <w:sz w:val="20"/>
+      </w:rPr>
+    </w:lvl>
+  </w:abstractNum>
+  <w:abstractNum w:abstractNumId="4" w15:restartNumberingAfterBreak="0">
     <w:nsid w:val="0FD354F6"/>
     <w:multiLevelType w:val="multilevel"/>
     <w:tmpl w:val="5DA04E98"/>
@@ -4026,7 +6343,7 @@
       </w:rPr>
     </w:lvl>
   </w:abstractNum>
-  <w:abstractNum w:abstractNumId="3" w15:restartNumberingAfterBreak="0">
+  <w:abstractNum w:abstractNumId="5" w15:restartNumberingAfterBreak="0">
     <w:nsid w:val="150A4E20"/>
     <w:multiLevelType w:val="hybridMultilevel"/>
     <w:tmpl w:val="DDC2E286"/>
@@ -4139,7 +6456,7 @@
       </w:rPr>
     </w:lvl>
   </w:abstractNum>
-  <w:abstractNum w:abstractNumId="4" w15:restartNumberingAfterBreak="0">
+  <w:abstractNum w:abstractNumId="6" w15:restartNumberingAfterBreak="0">
     <w:nsid w:val="20E36BCC"/>
     <w:multiLevelType w:val="multilevel"/>
     <w:tmpl w:val="658C1AF0"/>
@@ -4288,7 +6605,7 @@
       </w:rPr>
     </w:lvl>
   </w:abstractNum>
-  <w:abstractNum w:abstractNumId="5" w15:restartNumberingAfterBreak="0">
+  <w:abstractNum w:abstractNumId="7" w15:restartNumberingAfterBreak="0">
     <w:nsid w:val="24E11688"/>
     <w:multiLevelType w:val="multilevel"/>
     <w:tmpl w:val="442A6C3C"/>
@@ -4437,7 +6754,865 @@
       </w:rPr>
     </w:lvl>
   </w:abstractNum>
-  <w:abstractNum w:abstractNumId="6" w15:restartNumberingAfterBreak="0">
+  <w:abstractNum w:abstractNumId="8" w15:restartNumberingAfterBreak="0">
+    <w:nsid w:val="25C07279"/>
+    <w:multiLevelType w:val="multilevel"/>
+    <w:tmpl w:val="BD0019E4"/>
+    <w:lvl w:ilvl="0">
+      <w:start w:val="1"/>
+      <w:numFmt w:val="bullet"/>
+      <w:lvlText w:val=""/>
+      <w:lvlJc w:val="left"/>
+      <w:pPr>
+        <w:tabs>
+          <w:tab w:val="num" w:pos="720"/>
+        </w:tabs>
+        <w:ind w:left="720" w:hanging="360"/>
+      </w:pPr>
+      <w:rPr>
+        <w:rFonts w:ascii="Symbol" w:hAnsi="Symbol" w:hint="default"/>
+        <w:sz w:val="20"/>
+      </w:rPr>
+    </w:lvl>
+    <w:lvl w:ilvl="1">
+      <w:start w:val="1"/>
+      <w:numFmt w:val="bullet"/>
+      <w:lvlText w:val="o"/>
+      <w:lvlJc w:val="left"/>
+      <w:pPr>
+        <w:tabs>
+          <w:tab w:val="num" w:pos="1440"/>
+        </w:tabs>
+        <w:ind w:left="1440" w:hanging="360"/>
+      </w:pPr>
+      <w:rPr>
+        <w:rFonts w:ascii="Courier New" w:hAnsi="Courier New" w:hint="default"/>
+        <w:sz w:val="20"/>
+      </w:rPr>
+    </w:lvl>
+    <w:lvl w:ilvl="2" w:tentative="1">
+      <w:start w:val="1"/>
+      <w:numFmt w:val="bullet"/>
+      <w:lvlText w:val=""/>
+      <w:lvlJc w:val="left"/>
+      <w:pPr>
+        <w:tabs>
+          <w:tab w:val="num" w:pos="2160"/>
+        </w:tabs>
+        <w:ind w:left="2160" w:hanging="360"/>
+      </w:pPr>
+      <w:rPr>
+        <w:rFonts w:ascii="Wingdings" w:hAnsi="Wingdings" w:hint="default"/>
+        <w:sz w:val="20"/>
+      </w:rPr>
+    </w:lvl>
+    <w:lvl w:ilvl="3" w:tentative="1">
+      <w:start w:val="1"/>
+      <w:numFmt w:val="bullet"/>
+      <w:lvlText w:val=""/>
+      <w:lvlJc w:val="left"/>
+      <w:pPr>
+        <w:tabs>
+          <w:tab w:val="num" w:pos="2880"/>
+        </w:tabs>
+        <w:ind w:left="2880" w:hanging="360"/>
+      </w:pPr>
+      <w:rPr>
+        <w:rFonts w:ascii="Wingdings" w:hAnsi="Wingdings" w:hint="default"/>
+        <w:sz w:val="20"/>
+      </w:rPr>
+    </w:lvl>
+    <w:lvl w:ilvl="4" w:tentative="1">
+      <w:start w:val="1"/>
+      <w:numFmt w:val="bullet"/>
+      <w:lvlText w:val=""/>
+      <w:lvlJc w:val="left"/>
+      <w:pPr>
+        <w:tabs>
+          <w:tab w:val="num" w:pos="3600"/>
+        </w:tabs>
+        <w:ind w:left="3600" w:hanging="360"/>
+      </w:pPr>
+      <w:rPr>
+        <w:rFonts w:ascii="Wingdings" w:hAnsi="Wingdings" w:hint="default"/>
+        <w:sz w:val="20"/>
+      </w:rPr>
+    </w:lvl>
+    <w:lvl w:ilvl="5" w:tentative="1">
+      <w:start w:val="1"/>
+      <w:numFmt w:val="bullet"/>
+      <w:lvlText w:val=""/>
+      <w:lvlJc w:val="left"/>
+      <w:pPr>
+        <w:tabs>
+          <w:tab w:val="num" w:pos="4320"/>
+        </w:tabs>
+        <w:ind w:left="4320" w:hanging="360"/>
+      </w:pPr>
+      <w:rPr>
+        <w:rFonts w:ascii="Wingdings" w:hAnsi="Wingdings" w:hint="default"/>
+        <w:sz w:val="20"/>
+      </w:rPr>
+    </w:lvl>
+    <w:lvl w:ilvl="6" w:tentative="1">
+      <w:start w:val="1"/>
+      <w:numFmt w:val="bullet"/>
+      <w:lvlText w:val=""/>
+      <w:lvlJc w:val="left"/>
+      <w:pPr>
+        <w:tabs>
+          <w:tab w:val="num" w:pos="5040"/>
+        </w:tabs>
+        <w:ind w:left="5040" w:hanging="360"/>
+      </w:pPr>
+      <w:rPr>
+        <w:rFonts w:ascii="Wingdings" w:hAnsi="Wingdings" w:hint="default"/>
+        <w:sz w:val="20"/>
+      </w:rPr>
+    </w:lvl>
+    <w:lvl w:ilvl="7" w:tentative="1">
+      <w:start w:val="1"/>
+      <w:numFmt w:val="bullet"/>
+      <w:lvlText w:val=""/>
+      <w:lvlJc w:val="left"/>
+      <w:pPr>
+        <w:tabs>
+          <w:tab w:val="num" w:pos="5760"/>
+        </w:tabs>
+        <w:ind w:left="5760" w:hanging="360"/>
+      </w:pPr>
+      <w:rPr>
+        <w:rFonts w:ascii="Wingdings" w:hAnsi="Wingdings" w:hint="default"/>
+        <w:sz w:val="20"/>
+      </w:rPr>
+    </w:lvl>
+    <w:lvl w:ilvl="8" w:tentative="1">
+      <w:start w:val="1"/>
+      <w:numFmt w:val="bullet"/>
+      <w:lvlText w:val=""/>
+      <w:lvlJc w:val="left"/>
+      <w:pPr>
+        <w:tabs>
+          <w:tab w:val="num" w:pos="6480"/>
+        </w:tabs>
+        <w:ind w:left="6480" w:hanging="360"/>
+      </w:pPr>
+      <w:rPr>
+        <w:rFonts w:ascii="Wingdings" w:hAnsi="Wingdings" w:hint="default"/>
+        <w:sz w:val="20"/>
+      </w:rPr>
+    </w:lvl>
+  </w:abstractNum>
+  <w:abstractNum w:abstractNumId="9" w15:restartNumberingAfterBreak="0">
+    <w:nsid w:val="281E4995"/>
+    <w:multiLevelType w:val="multilevel"/>
+    <w:tmpl w:val="24B0CB32"/>
+    <w:lvl w:ilvl="0">
+      <w:start w:val="1"/>
+      <w:numFmt w:val="bullet"/>
+      <w:lvlText w:val=""/>
+      <w:lvlJc w:val="left"/>
+      <w:pPr>
+        <w:tabs>
+          <w:tab w:val="num" w:pos="720"/>
+        </w:tabs>
+        <w:ind w:left="720" w:hanging="360"/>
+      </w:pPr>
+      <w:rPr>
+        <w:rFonts w:ascii="Symbol" w:hAnsi="Symbol" w:hint="default"/>
+        <w:sz w:val="20"/>
+      </w:rPr>
+    </w:lvl>
+    <w:lvl w:ilvl="1" w:tentative="1">
+      <w:start w:val="1"/>
+      <w:numFmt w:val="bullet"/>
+      <w:lvlText w:val="o"/>
+      <w:lvlJc w:val="left"/>
+      <w:pPr>
+        <w:tabs>
+          <w:tab w:val="num" w:pos="1440"/>
+        </w:tabs>
+        <w:ind w:left="1440" w:hanging="360"/>
+      </w:pPr>
+      <w:rPr>
+        <w:rFonts w:ascii="Courier New" w:hAnsi="Courier New" w:hint="default"/>
+        <w:sz w:val="20"/>
+      </w:rPr>
+    </w:lvl>
+    <w:lvl w:ilvl="2" w:tentative="1">
+      <w:start w:val="1"/>
+      <w:numFmt w:val="bullet"/>
+      <w:lvlText w:val=""/>
+      <w:lvlJc w:val="left"/>
+      <w:pPr>
+        <w:tabs>
+          <w:tab w:val="num" w:pos="2160"/>
+        </w:tabs>
+        <w:ind w:left="2160" w:hanging="360"/>
+      </w:pPr>
+      <w:rPr>
+        <w:rFonts w:ascii="Wingdings" w:hAnsi="Wingdings" w:hint="default"/>
+        <w:sz w:val="20"/>
+      </w:rPr>
+    </w:lvl>
+    <w:lvl w:ilvl="3" w:tentative="1">
+      <w:start w:val="1"/>
+      <w:numFmt w:val="bullet"/>
+      <w:lvlText w:val=""/>
+      <w:lvlJc w:val="left"/>
+      <w:pPr>
+        <w:tabs>
+          <w:tab w:val="num" w:pos="2880"/>
+        </w:tabs>
+        <w:ind w:left="2880" w:hanging="360"/>
+      </w:pPr>
+      <w:rPr>
+        <w:rFonts w:ascii="Wingdings" w:hAnsi="Wingdings" w:hint="default"/>
+        <w:sz w:val="20"/>
+      </w:rPr>
+    </w:lvl>
+    <w:lvl w:ilvl="4" w:tentative="1">
+      <w:start w:val="1"/>
+      <w:numFmt w:val="bullet"/>
+      <w:lvlText w:val=""/>
+      <w:lvlJc w:val="left"/>
+      <w:pPr>
+        <w:tabs>
+          <w:tab w:val="num" w:pos="3600"/>
+        </w:tabs>
+        <w:ind w:left="3600" w:hanging="360"/>
+      </w:pPr>
+      <w:rPr>
+        <w:rFonts w:ascii="Wingdings" w:hAnsi="Wingdings" w:hint="default"/>
+        <w:sz w:val="20"/>
+      </w:rPr>
+    </w:lvl>
+    <w:lvl w:ilvl="5" w:tentative="1">
+      <w:start w:val="1"/>
+      <w:numFmt w:val="bullet"/>
+      <w:lvlText w:val=""/>
+      <w:lvlJc w:val="left"/>
+      <w:pPr>
+        <w:tabs>
+          <w:tab w:val="num" w:pos="4320"/>
+        </w:tabs>
+        <w:ind w:left="4320" w:hanging="360"/>
+      </w:pPr>
+      <w:rPr>
+        <w:rFonts w:ascii="Wingdings" w:hAnsi="Wingdings" w:hint="default"/>
+        <w:sz w:val="20"/>
+      </w:rPr>
+    </w:lvl>
+    <w:lvl w:ilvl="6" w:tentative="1">
+      <w:start w:val="1"/>
+      <w:numFmt w:val="bullet"/>
+      <w:lvlText w:val=""/>
+      <w:lvlJc w:val="left"/>
+      <w:pPr>
+        <w:tabs>
+          <w:tab w:val="num" w:pos="5040"/>
+        </w:tabs>
+        <w:ind w:left="5040" w:hanging="360"/>
+      </w:pPr>
+      <w:rPr>
+        <w:rFonts w:ascii="Wingdings" w:hAnsi="Wingdings" w:hint="default"/>
+        <w:sz w:val="20"/>
+      </w:rPr>
+    </w:lvl>
+    <w:lvl w:ilvl="7" w:tentative="1">
+      <w:start w:val="1"/>
+      <w:numFmt w:val="bullet"/>
+      <w:lvlText w:val=""/>
+      <w:lvlJc w:val="left"/>
+      <w:pPr>
+        <w:tabs>
+          <w:tab w:val="num" w:pos="5760"/>
+        </w:tabs>
+        <w:ind w:left="5760" w:hanging="360"/>
+      </w:pPr>
+      <w:rPr>
+        <w:rFonts w:ascii="Wingdings" w:hAnsi="Wingdings" w:hint="default"/>
+        <w:sz w:val="20"/>
+      </w:rPr>
+    </w:lvl>
+    <w:lvl w:ilvl="8" w:tentative="1">
+      <w:start w:val="1"/>
+      <w:numFmt w:val="bullet"/>
+      <w:lvlText w:val=""/>
+      <w:lvlJc w:val="left"/>
+      <w:pPr>
+        <w:tabs>
+          <w:tab w:val="num" w:pos="6480"/>
+        </w:tabs>
+        <w:ind w:left="6480" w:hanging="360"/>
+      </w:pPr>
+      <w:rPr>
+        <w:rFonts w:ascii="Wingdings" w:hAnsi="Wingdings" w:hint="default"/>
+        <w:sz w:val="20"/>
+      </w:rPr>
+    </w:lvl>
+  </w:abstractNum>
+  <w:abstractNum w:abstractNumId="10" w15:restartNumberingAfterBreak="0">
+    <w:nsid w:val="2A7A4B00"/>
+    <w:multiLevelType w:val="multilevel"/>
+    <w:tmpl w:val="0CE867D0"/>
+    <w:lvl w:ilvl="0">
+      <w:start w:val="1"/>
+      <w:numFmt w:val="bullet"/>
+      <w:lvlText w:val=""/>
+      <w:lvlJc w:val="left"/>
+      <w:pPr>
+        <w:tabs>
+          <w:tab w:val="num" w:pos="720"/>
+        </w:tabs>
+        <w:ind w:left="720" w:hanging="360"/>
+      </w:pPr>
+      <w:rPr>
+        <w:rFonts w:ascii="Symbol" w:hAnsi="Symbol" w:hint="default"/>
+        <w:sz w:val="20"/>
+      </w:rPr>
+    </w:lvl>
+    <w:lvl w:ilvl="1" w:tentative="1">
+      <w:start w:val="1"/>
+      <w:numFmt w:val="bullet"/>
+      <w:lvlText w:val="o"/>
+      <w:lvlJc w:val="left"/>
+      <w:pPr>
+        <w:tabs>
+          <w:tab w:val="num" w:pos="1440"/>
+        </w:tabs>
+        <w:ind w:left="1440" w:hanging="360"/>
+      </w:pPr>
+      <w:rPr>
+        <w:rFonts w:ascii="Courier New" w:hAnsi="Courier New" w:hint="default"/>
+        <w:sz w:val="20"/>
+      </w:rPr>
+    </w:lvl>
+    <w:lvl w:ilvl="2" w:tentative="1">
+      <w:start w:val="1"/>
+      <w:numFmt w:val="bullet"/>
+      <w:lvlText w:val=""/>
+      <w:lvlJc w:val="left"/>
+      <w:pPr>
+        <w:tabs>
+          <w:tab w:val="num" w:pos="2160"/>
+        </w:tabs>
+        <w:ind w:left="2160" w:hanging="360"/>
+      </w:pPr>
+      <w:rPr>
+        <w:rFonts w:ascii="Wingdings" w:hAnsi="Wingdings" w:hint="default"/>
+        <w:sz w:val="20"/>
+      </w:rPr>
+    </w:lvl>
+    <w:lvl w:ilvl="3" w:tentative="1">
+      <w:start w:val="1"/>
+      <w:numFmt w:val="bullet"/>
+      <w:lvlText w:val=""/>
+      <w:lvlJc w:val="left"/>
+      <w:pPr>
+        <w:tabs>
+          <w:tab w:val="num" w:pos="2880"/>
+        </w:tabs>
+        <w:ind w:left="2880" w:hanging="360"/>
+      </w:pPr>
+      <w:rPr>
+        <w:rFonts w:ascii="Wingdings" w:hAnsi="Wingdings" w:hint="default"/>
+        <w:sz w:val="20"/>
+      </w:rPr>
+    </w:lvl>
+    <w:lvl w:ilvl="4" w:tentative="1">
+      <w:start w:val="1"/>
+      <w:numFmt w:val="bullet"/>
+      <w:lvlText w:val=""/>
+      <w:lvlJc w:val="left"/>
+      <w:pPr>
+        <w:tabs>
+          <w:tab w:val="num" w:pos="3600"/>
+        </w:tabs>
+        <w:ind w:left="3600" w:hanging="360"/>
+      </w:pPr>
+      <w:rPr>
+        <w:rFonts w:ascii="Wingdings" w:hAnsi="Wingdings" w:hint="default"/>
+        <w:sz w:val="20"/>
+      </w:rPr>
+    </w:lvl>
+    <w:lvl w:ilvl="5" w:tentative="1">
+      <w:start w:val="1"/>
+      <w:numFmt w:val="bullet"/>
+      <w:lvlText w:val=""/>
+      <w:lvlJc w:val="left"/>
+      <w:pPr>
+        <w:tabs>
+          <w:tab w:val="num" w:pos="4320"/>
+        </w:tabs>
+        <w:ind w:left="4320" w:hanging="360"/>
+      </w:pPr>
+      <w:rPr>
+        <w:rFonts w:ascii="Wingdings" w:hAnsi="Wingdings" w:hint="default"/>
+        <w:sz w:val="20"/>
+      </w:rPr>
+    </w:lvl>
+    <w:lvl w:ilvl="6" w:tentative="1">
+      <w:start w:val="1"/>
+      <w:numFmt w:val="bullet"/>
+      <w:lvlText w:val=""/>
+      <w:lvlJc w:val="left"/>
+      <w:pPr>
+        <w:tabs>
+          <w:tab w:val="num" w:pos="5040"/>
+        </w:tabs>
+        <w:ind w:left="5040" w:hanging="360"/>
+      </w:pPr>
+      <w:rPr>
+        <w:rFonts w:ascii="Wingdings" w:hAnsi="Wingdings" w:hint="default"/>
+        <w:sz w:val="20"/>
+      </w:rPr>
+    </w:lvl>
+    <w:lvl w:ilvl="7" w:tentative="1">
+      <w:start w:val="1"/>
+      <w:numFmt w:val="bullet"/>
+      <w:lvlText w:val=""/>
+      <w:lvlJc w:val="left"/>
+      <w:pPr>
+        <w:tabs>
+          <w:tab w:val="num" w:pos="5760"/>
+        </w:tabs>
+        <w:ind w:left="5760" w:hanging="360"/>
+      </w:pPr>
+      <w:rPr>
+        <w:rFonts w:ascii="Wingdings" w:hAnsi="Wingdings" w:hint="default"/>
+        <w:sz w:val="20"/>
+      </w:rPr>
+    </w:lvl>
+    <w:lvl w:ilvl="8" w:tentative="1">
+      <w:start w:val="1"/>
+      <w:numFmt w:val="bullet"/>
+      <w:lvlText w:val=""/>
+      <w:lvlJc w:val="left"/>
+      <w:pPr>
+        <w:tabs>
+          <w:tab w:val="num" w:pos="6480"/>
+        </w:tabs>
+        <w:ind w:left="6480" w:hanging="360"/>
+      </w:pPr>
+      <w:rPr>
+        <w:rFonts w:ascii="Wingdings" w:hAnsi="Wingdings" w:hint="default"/>
+        <w:sz w:val="20"/>
+      </w:rPr>
+    </w:lvl>
+  </w:abstractNum>
+  <w:abstractNum w:abstractNumId="11" w15:restartNumberingAfterBreak="0">
+    <w:nsid w:val="2D8E6F74"/>
+    <w:multiLevelType w:val="multilevel"/>
+    <w:tmpl w:val="F370D8D0"/>
+    <w:lvl w:ilvl="0">
+      <w:start w:val="1"/>
+      <w:numFmt w:val="decimal"/>
+      <w:lvlText w:val="%1."/>
+      <w:lvlJc w:val="left"/>
+      <w:pPr>
+        <w:tabs>
+          <w:tab w:val="num" w:pos="720"/>
+        </w:tabs>
+        <w:ind w:left="720" w:hanging="360"/>
+      </w:pPr>
+    </w:lvl>
+    <w:lvl w:ilvl="1" w:tentative="1">
+      <w:start w:val="1"/>
+      <w:numFmt w:val="decimal"/>
+      <w:lvlText w:val="%2."/>
+      <w:lvlJc w:val="left"/>
+      <w:pPr>
+        <w:tabs>
+          <w:tab w:val="num" w:pos="1440"/>
+        </w:tabs>
+        <w:ind w:left="1440" w:hanging="360"/>
+      </w:pPr>
+    </w:lvl>
+    <w:lvl w:ilvl="2" w:tentative="1">
+      <w:start w:val="1"/>
+      <w:numFmt w:val="decimal"/>
+      <w:lvlText w:val="%3."/>
+      <w:lvlJc w:val="left"/>
+      <w:pPr>
+        <w:tabs>
+          <w:tab w:val="num" w:pos="2160"/>
+        </w:tabs>
+        <w:ind w:left="2160" w:hanging="360"/>
+      </w:pPr>
+    </w:lvl>
+    <w:lvl w:ilvl="3" w:tentative="1">
+      <w:start w:val="1"/>
+      <w:numFmt w:val="decimal"/>
+      <w:lvlText w:val="%4."/>
+      <w:lvlJc w:val="left"/>
+      <w:pPr>
+        <w:tabs>
+          <w:tab w:val="num" w:pos="2880"/>
+        </w:tabs>
+        <w:ind w:left="2880" w:hanging="360"/>
+      </w:pPr>
+    </w:lvl>
+    <w:lvl w:ilvl="4" w:tentative="1">
+      <w:start w:val="1"/>
+      <w:numFmt w:val="decimal"/>
+      <w:lvlText w:val="%5."/>
+      <w:lvlJc w:val="left"/>
+      <w:pPr>
+        <w:tabs>
+          <w:tab w:val="num" w:pos="3600"/>
+        </w:tabs>
+        <w:ind w:left="3600" w:hanging="360"/>
+      </w:pPr>
+    </w:lvl>
+    <w:lvl w:ilvl="5" w:tentative="1">
+      <w:start w:val="1"/>
+      <w:numFmt w:val="decimal"/>
+      <w:lvlText w:val="%6."/>
+      <w:lvlJc w:val="left"/>
+      <w:pPr>
+        <w:tabs>
+          <w:tab w:val="num" w:pos="4320"/>
+        </w:tabs>
+        <w:ind w:left="4320" w:hanging="360"/>
+      </w:pPr>
+    </w:lvl>
+    <w:lvl w:ilvl="6" w:tentative="1">
+      <w:start w:val="1"/>
+      <w:numFmt w:val="decimal"/>
+      <w:lvlText w:val="%7."/>
+      <w:lvlJc w:val="left"/>
+      <w:pPr>
+        <w:tabs>
+          <w:tab w:val="num" w:pos="5040"/>
+        </w:tabs>
+        <w:ind w:left="5040" w:hanging="360"/>
+      </w:pPr>
+    </w:lvl>
+    <w:lvl w:ilvl="7" w:tentative="1">
+      <w:start w:val="1"/>
+      <w:numFmt w:val="decimal"/>
+      <w:lvlText w:val="%8."/>
+      <w:lvlJc w:val="left"/>
+      <w:pPr>
+        <w:tabs>
+          <w:tab w:val="num" w:pos="5760"/>
+        </w:tabs>
+        <w:ind w:left="5760" w:hanging="360"/>
+      </w:pPr>
+    </w:lvl>
+    <w:lvl w:ilvl="8" w:tentative="1">
+      <w:start w:val="1"/>
+      <w:numFmt w:val="decimal"/>
+      <w:lvlText w:val="%9."/>
+      <w:lvlJc w:val="left"/>
+      <w:pPr>
+        <w:tabs>
+          <w:tab w:val="num" w:pos="6480"/>
+        </w:tabs>
+        <w:ind w:left="6480" w:hanging="360"/>
+      </w:pPr>
+    </w:lvl>
+  </w:abstractNum>
+  <w:abstractNum w:abstractNumId="12" w15:restartNumberingAfterBreak="0">
+    <w:nsid w:val="2D997E39"/>
+    <w:multiLevelType w:val="multilevel"/>
+    <w:tmpl w:val="616A7834"/>
+    <w:lvl w:ilvl="0">
+      <w:start w:val="1"/>
+      <w:numFmt w:val="bullet"/>
+      <w:lvlText w:val=""/>
+      <w:lvlJc w:val="left"/>
+      <w:pPr>
+        <w:tabs>
+          <w:tab w:val="num" w:pos="720"/>
+        </w:tabs>
+        <w:ind w:left="720" w:hanging="360"/>
+      </w:pPr>
+      <w:rPr>
+        <w:rFonts w:ascii="Symbol" w:hAnsi="Symbol" w:hint="default"/>
+        <w:sz w:val="20"/>
+      </w:rPr>
+    </w:lvl>
+    <w:lvl w:ilvl="1" w:tentative="1">
+      <w:start w:val="1"/>
+      <w:numFmt w:val="bullet"/>
+      <w:lvlText w:val="o"/>
+      <w:lvlJc w:val="left"/>
+      <w:pPr>
+        <w:tabs>
+          <w:tab w:val="num" w:pos="1440"/>
+        </w:tabs>
+        <w:ind w:left="1440" w:hanging="360"/>
+      </w:pPr>
+      <w:rPr>
+        <w:rFonts w:ascii="Courier New" w:hAnsi="Courier New" w:hint="default"/>
+        <w:sz w:val="20"/>
+      </w:rPr>
+    </w:lvl>
+    <w:lvl w:ilvl="2" w:tentative="1">
+      <w:start w:val="1"/>
+      <w:numFmt w:val="bullet"/>
+      <w:lvlText w:val=""/>
+      <w:lvlJc w:val="left"/>
+      <w:pPr>
+        <w:tabs>
+          <w:tab w:val="num" w:pos="2160"/>
+        </w:tabs>
+        <w:ind w:left="2160" w:hanging="360"/>
+      </w:pPr>
+      <w:rPr>
+        <w:rFonts w:ascii="Wingdings" w:hAnsi="Wingdings" w:hint="default"/>
+        <w:sz w:val="20"/>
+      </w:rPr>
+    </w:lvl>
+    <w:lvl w:ilvl="3" w:tentative="1">
+      <w:start w:val="1"/>
+      <w:numFmt w:val="bullet"/>
+      <w:lvlText w:val=""/>
+      <w:lvlJc w:val="left"/>
+      <w:pPr>
+        <w:tabs>
+          <w:tab w:val="num" w:pos="2880"/>
+        </w:tabs>
+        <w:ind w:left="2880" w:hanging="360"/>
+      </w:pPr>
+      <w:rPr>
+        <w:rFonts w:ascii="Wingdings" w:hAnsi="Wingdings" w:hint="default"/>
+        <w:sz w:val="20"/>
+      </w:rPr>
+    </w:lvl>
+    <w:lvl w:ilvl="4" w:tentative="1">
+      <w:start w:val="1"/>
+      <w:numFmt w:val="bullet"/>
+      <w:lvlText w:val=""/>
+      <w:lvlJc w:val="left"/>
+      <w:pPr>
+        <w:tabs>
+          <w:tab w:val="num" w:pos="3600"/>
+        </w:tabs>
+        <w:ind w:left="3600" w:hanging="360"/>
+      </w:pPr>
+      <w:rPr>
+        <w:rFonts w:ascii="Wingdings" w:hAnsi="Wingdings" w:hint="default"/>
+        <w:sz w:val="20"/>
+      </w:rPr>
+    </w:lvl>
+    <w:lvl w:ilvl="5" w:tentative="1">
+      <w:start w:val="1"/>
+      <w:numFmt w:val="bullet"/>
+      <w:lvlText w:val=""/>
+      <w:lvlJc w:val="left"/>
+      <w:pPr>
+        <w:tabs>
+          <w:tab w:val="num" w:pos="4320"/>
+        </w:tabs>
+        <w:ind w:left="4320" w:hanging="360"/>
+      </w:pPr>
+      <w:rPr>
+        <w:rFonts w:ascii="Wingdings" w:hAnsi="Wingdings" w:hint="default"/>
+        <w:sz w:val="20"/>
+      </w:rPr>
+    </w:lvl>
+    <w:lvl w:ilvl="6" w:tentative="1">
+      <w:start w:val="1"/>
+      <w:numFmt w:val="bullet"/>
+      <w:lvlText w:val=""/>
+      <w:lvlJc w:val="left"/>
+      <w:pPr>
+        <w:tabs>
+          <w:tab w:val="num" w:pos="5040"/>
+        </w:tabs>
+        <w:ind w:left="5040" w:hanging="360"/>
+      </w:pPr>
+      <w:rPr>
+        <w:rFonts w:ascii="Wingdings" w:hAnsi="Wingdings" w:hint="default"/>
+        <w:sz w:val="20"/>
+      </w:rPr>
+    </w:lvl>
+    <w:lvl w:ilvl="7" w:tentative="1">
+      <w:start w:val="1"/>
+      <w:numFmt w:val="bullet"/>
+      <w:lvlText w:val=""/>
+      <w:lvlJc w:val="left"/>
+      <w:pPr>
+        <w:tabs>
+          <w:tab w:val="num" w:pos="5760"/>
+        </w:tabs>
+        <w:ind w:left="5760" w:hanging="360"/>
+      </w:pPr>
+      <w:rPr>
+        <w:rFonts w:ascii="Wingdings" w:hAnsi="Wingdings" w:hint="default"/>
+        <w:sz w:val="20"/>
+      </w:rPr>
+    </w:lvl>
+    <w:lvl w:ilvl="8" w:tentative="1">
+      <w:start w:val="1"/>
+      <w:numFmt w:val="bullet"/>
+      <w:lvlText w:val=""/>
+      <w:lvlJc w:val="left"/>
+      <w:pPr>
+        <w:tabs>
+          <w:tab w:val="num" w:pos="6480"/>
+        </w:tabs>
+        <w:ind w:left="6480" w:hanging="360"/>
+      </w:pPr>
+      <w:rPr>
+        <w:rFonts w:ascii="Wingdings" w:hAnsi="Wingdings" w:hint="default"/>
+        <w:sz w:val="20"/>
+      </w:rPr>
+    </w:lvl>
+  </w:abstractNum>
+  <w:abstractNum w:abstractNumId="13" w15:restartNumberingAfterBreak="0">
+    <w:nsid w:val="33AE62B5"/>
+    <w:multiLevelType w:val="multilevel"/>
+    <w:tmpl w:val="0000749E"/>
+    <w:lvl w:ilvl="0">
+      <w:start w:val="1"/>
+      <w:numFmt w:val="bullet"/>
+      <w:lvlText w:val=""/>
+      <w:lvlJc w:val="left"/>
+      <w:pPr>
+        <w:tabs>
+          <w:tab w:val="num" w:pos="720"/>
+        </w:tabs>
+        <w:ind w:left="720" w:hanging="360"/>
+      </w:pPr>
+      <w:rPr>
+        <w:rFonts w:ascii="Symbol" w:hAnsi="Symbol" w:hint="default"/>
+        <w:sz w:val="20"/>
+      </w:rPr>
+    </w:lvl>
+    <w:lvl w:ilvl="1" w:tentative="1">
+      <w:start w:val="1"/>
+      <w:numFmt w:val="bullet"/>
+      <w:lvlText w:val="o"/>
+      <w:lvlJc w:val="left"/>
+      <w:pPr>
+        <w:tabs>
+          <w:tab w:val="num" w:pos="1440"/>
+        </w:tabs>
+        <w:ind w:left="1440" w:hanging="360"/>
+      </w:pPr>
+      <w:rPr>
+        <w:rFonts w:ascii="Courier New" w:hAnsi="Courier New" w:hint="default"/>
+        <w:sz w:val="20"/>
+      </w:rPr>
+    </w:lvl>
+    <w:lvl w:ilvl="2" w:tentative="1">
+      <w:start w:val="1"/>
+      <w:numFmt w:val="bullet"/>
+      <w:lvlText w:val=""/>
+      <w:lvlJc w:val="left"/>
+      <w:pPr>
+        <w:tabs>
+          <w:tab w:val="num" w:pos="2160"/>
+        </w:tabs>
+        <w:ind w:left="2160" w:hanging="360"/>
+      </w:pPr>
+      <w:rPr>
+        <w:rFonts w:ascii="Wingdings" w:hAnsi="Wingdings" w:hint="default"/>
+        <w:sz w:val="20"/>
+      </w:rPr>
+    </w:lvl>
+    <w:lvl w:ilvl="3" w:tentative="1">
+      <w:start w:val="1"/>
+      <w:numFmt w:val="bullet"/>
+      <w:lvlText w:val=""/>
+      <w:lvlJc w:val="left"/>
+      <w:pPr>
+        <w:tabs>
+          <w:tab w:val="num" w:pos="2880"/>
+        </w:tabs>
+        <w:ind w:left="2880" w:hanging="360"/>
+      </w:pPr>
+      <w:rPr>
+        <w:rFonts w:ascii="Wingdings" w:hAnsi="Wingdings" w:hint="default"/>
+        <w:sz w:val="20"/>
+      </w:rPr>
+    </w:lvl>
+    <w:lvl w:ilvl="4" w:tentative="1">
+      <w:start w:val="1"/>
+      <w:numFmt w:val="bullet"/>
+      <w:lvlText w:val=""/>
+      <w:lvlJc w:val="left"/>
+      <w:pPr>
+        <w:tabs>
+          <w:tab w:val="num" w:pos="3600"/>
+        </w:tabs>
+        <w:ind w:left="3600" w:hanging="360"/>
+      </w:pPr>
+      <w:rPr>
+        <w:rFonts w:ascii="Wingdings" w:hAnsi="Wingdings" w:hint="default"/>
+        <w:sz w:val="20"/>
+      </w:rPr>
+    </w:lvl>
+    <w:lvl w:ilvl="5" w:tentative="1">
+      <w:start w:val="1"/>
+      <w:numFmt w:val="bullet"/>
+      <w:lvlText w:val=""/>
+      <w:lvlJc w:val="left"/>
+      <w:pPr>
+        <w:tabs>
+          <w:tab w:val="num" w:pos="4320"/>
+        </w:tabs>
+        <w:ind w:left="4320" w:hanging="360"/>
+      </w:pPr>
+      <w:rPr>
+        <w:rFonts w:ascii="Wingdings" w:hAnsi="Wingdings" w:hint="default"/>
+        <w:sz w:val="20"/>
+      </w:rPr>
+    </w:lvl>
+    <w:lvl w:ilvl="6" w:tentative="1">
+      <w:start w:val="1"/>
+      <w:numFmt w:val="bullet"/>
+      <w:lvlText w:val=""/>
+      <w:lvlJc w:val="left"/>
+      <w:pPr>
+        <w:tabs>
+          <w:tab w:val="num" w:pos="5040"/>
+        </w:tabs>
+        <w:ind w:left="5040" w:hanging="360"/>
+      </w:pPr>
+      <w:rPr>
+        <w:rFonts w:ascii="Wingdings" w:hAnsi="Wingdings" w:hint="default"/>
+        <w:sz w:val="20"/>
+      </w:rPr>
+    </w:lvl>
+    <w:lvl w:ilvl="7" w:tentative="1">
+      <w:start w:val="1"/>
+      <w:numFmt w:val="bullet"/>
+      <w:lvlText w:val=""/>
+      <w:lvlJc w:val="left"/>
+      <w:pPr>
+        <w:tabs>
+          <w:tab w:val="num" w:pos="5760"/>
+        </w:tabs>
+        <w:ind w:left="5760" w:hanging="360"/>
+      </w:pPr>
+      <w:rPr>
+        <w:rFonts w:ascii="Wingdings" w:hAnsi="Wingdings" w:hint="default"/>
+        <w:sz w:val="20"/>
+      </w:rPr>
+    </w:lvl>
+    <w:lvl w:ilvl="8" w:tentative="1">
+      <w:start w:val="1"/>
+      <w:numFmt w:val="bullet"/>
+      <w:lvlText w:val=""/>
+      <w:lvlJc w:val="left"/>
+      <w:pPr>
+        <w:tabs>
+          <w:tab w:val="num" w:pos="6480"/>
+        </w:tabs>
+        <w:ind w:left="6480" w:hanging="360"/>
+      </w:pPr>
+      <w:rPr>
+        <w:rFonts w:ascii="Wingdings" w:hAnsi="Wingdings" w:hint="default"/>
+        <w:sz w:val="20"/>
+      </w:rPr>
+    </w:lvl>
+  </w:abstractNum>
+  <w:abstractNum w:abstractNumId="14" w15:restartNumberingAfterBreak="0">
     <w:nsid w:val="42DA7176"/>
     <w:multiLevelType w:val="multilevel"/>
     <w:tmpl w:val="3BB04A34"/>
@@ -4586,7 +7761,7 @@
       </w:rPr>
     </w:lvl>
   </w:abstractNum>
-  <w:abstractNum w:abstractNumId="7" w15:restartNumberingAfterBreak="0">
+  <w:abstractNum w:abstractNumId="15" w15:restartNumberingAfterBreak="0">
     <w:nsid w:val="443E4F7C"/>
     <w:multiLevelType w:val="multilevel"/>
     <w:tmpl w:val="FA1CB5AC"/>
@@ -4735,7 +7910,7 @@
       </w:rPr>
     </w:lvl>
   </w:abstractNum>
-  <w:abstractNum w:abstractNumId="8" w15:restartNumberingAfterBreak="0">
+  <w:abstractNum w:abstractNumId="16" w15:restartNumberingAfterBreak="0">
     <w:nsid w:val="4A956F09"/>
     <w:multiLevelType w:val="multilevel"/>
     <w:tmpl w:val="D28012A4"/>
@@ -4884,7 +8059,7 @@
       </w:rPr>
     </w:lvl>
   </w:abstractNum>
-  <w:abstractNum w:abstractNumId="9" w15:restartNumberingAfterBreak="0">
+  <w:abstractNum w:abstractNumId="17" w15:restartNumberingAfterBreak="0">
     <w:nsid w:val="634E735F"/>
     <w:multiLevelType w:val="multilevel"/>
     <w:tmpl w:val="BAD63DDA"/>
@@ -5033,7 +8208,7 @@
       </w:rPr>
     </w:lvl>
   </w:abstractNum>
-  <w:abstractNum w:abstractNumId="10" w15:restartNumberingAfterBreak="0">
+  <w:abstractNum w:abstractNumId="18" w15:restartNumberingAfterBreak="0">
     <w:nsid w:val="703027DB"/>
     <w:multiLevelType w:val="multilevel"/>
     <w:tmpl w:val="5378B2A0"/>
@@ -5182,7 +8357,7 @@
       </w:rPr>
     </w:lvl>
   </w:abstractNum>
-  <w:abstractNum w:abstractNumId="11" w15:restartNumberingAfterBreak="0">
+  <w:abstractNum w:abstractNumId="19" w15:restartNumberingAfterBreak="0">
     <w:nsid w:val="775831E8"/>
     <w:multiLevelType w:val="multilevel"/>
     <w:tmpl w:val="9D52FCD2"/>
@@ -5331,7 +8506,156 @@
       </w:rPr>
     </w:lvl>
   </w:abstractNum>
-  <w:abstractNum w:abstractNumId="12" w15:restartNumberingAfterBreak="0">
+  <w:abstractNum w:abstractNumId="20" w15:restartNumberingAfterBreak="0">
+    <w:nsid w:val="78E64F58"/>
+    <w:multiLevelType w:val="multilevel"/>
+    <w:tmpl w:val="4B9CF940"/>
+    <w:lvl w:ilvl="0">
+      <w:start w:val="1"/>
+      <w:numFmt w:val="bullet"/>
+      <w:lvlText w:val=""/>
+      <w:lvlJc w:val="left"/>
+      <w:pPr>
+        <w:tabs>
+          <w:tab w:val="num" w:pos="720"/>
+        </w:tabs>
+        <w:ind w:left="720" w:hanging="360"/>
+      </w:pPr>
+      <w:rPr>
+        <w:rFonts w:ascii="Symbol" w:hAnsi="Symbol" w:hint="default"/>
+        <w:sz w:val="20"/>
+      </w:rPr>
+    </w:lvl>
+    <w:lvl w:ilvl="1">
+      <w:start w:val="1"/>
+      <w:numFmt w:val="bullet"/>
+      <w:lvlText w:val="o"/>
+      <w:lvlJc w:val="left"/>
+      <w:pPr>
+        <w:tabs>
+          <w:tab w:val="num" w:pos="1440"/>
+        </w:tabs>
+        <w:ind w:left="1440" w:hanging="360"/>
+      </w:pPr>
+      <w:rPr>
+        <w:rFonts w:ascii="Courier New" w:hAnsi="Courier New" w:hint="default"/>
+        <w:sz w:val="20"/>
+      </w:rPr>
+    </w:lvl>
+    <w:lvl w:ilvl="2" w:tentative="1">
+      <w:start w:val="1"/>
+      <w:numFmt w:val="bullet"/>
+      <w:lvlText w:val=""/>
+      <w:lvlJc w:val="left"/>
+      <w:pPr>
+        <w:tabs>
+          <w:tab w:val="num" w:pos="2160"/>
+        </w:tabs>
+        <w:ind w:left="2160" w:hanging="360"/>
+      </w:pPr>
+      <w:rPr>
+        <w:rFonts w:ascii="Wingdings" w:hAnsi="Wingdings" w:hint="default"/>
+        <w:sz w:val="20"/>
+      </w:rPr>
+    </w:lvl>
+    <w:lvl w:ilvl="3" w:tentative="1">
+      <w:start w:val="1"/>
+      <w:numFmt w:val="bullet"/>
+      <w:lvlText w:val=""/>
+      <w:lvlJc w:val="left"/>
+      <w:pPr>
+        <w:tabs>
+          <w:tab w:val="num" w:pos="2880"/>
+        </w:tabs>
+        <w:ind w:left="2880" w:hanging="360"/>
+      </w:pPr>
+      <w:rPr>
+        <w:rFonts w:ascii="Wingdings" w:hAnsi="Wingdings" w:hint="default"/>
+        <w:sz w:val="20"/>
+      </w:rPr>
+    </w:lvl>
+    <w:lvl w:ilvl="4" w:tentative="1">
+      <w:start w:val="1"/>
+      <w:numFmt w:val="bullet"/>
+      <w:lvlText w:val=""/>
+      <w:lvlJc w:val="left"/>
+      <w:pPr>
+        <w:tabs>
+          <w:tab w:val="num" w:pos="3600"/>
+        </w:tabs>
+        <w:ind w:left="3600" w:hanging="360"/>
+      </w:pPr>
+      <w:rPr>
+        <w:rFonts w:ascii="Wingdings" w:hAnsi="Wingdings" w:hint="default"/>
+        <w:sz w:val="20"/>
+      </w:rPr>
+    </w:lvl>
+    <w:lvl w:ilvl="5" w:tentative="1">
+      <w:start w:val="1"/>
+      <w:numFmt w:val="bullet"/>
+      <w:lvlText w:val=""/>
+      <w:lvlJc w:val="left"/>
+      <w:pPr>
+        <w:tabs>
+          <w:tab w:val="num" w:pos="4320"/>
+        </w:tabs>
+        <w:ind w:left="4320" w:hanging="360"/>
+      </w:pPr>
+      <w:rPr>
+        <w:rFonts w:ascii="Wingdings" w:hAnsi="Wingdings" w:hint="default"/>
+        <w:sz w:val="20"/>
+      </w:rPr>
+    </w:lvl>
+    <w:lvl w:ilvl="6" w:tentative="1">
+      <w:start w:val="1"/>
+      <w:numFmt w:val="bullet"/>
+      <w:lvlText w:val=""/>
+      <w:lvlJc w:val="left"/>
+      <w:pPr>
+        <w:tabs>
+          <w:tab w:val="num" w:pos="5040"/>
+        </w:tabs>
+        <w:ind w:left="5040" w:hanging="360"/>
+      </w:pPr>
+      <w:rPr>
+        <w:rFonts w:ascii="Wingdings" w:hAnsi="Wingdings" w:hint="default"/>
+        <w:sz w:val="20"/>
+      </w:rPr>
+    </w:lvl>
+    <w:lvl w:ilvl="7" w:tentative="1">
+      <w:start w:val="1"/>
+      <w:numFmt w:val="bullet"/>
+      <w:lvlText w:val=""/>
+      <w:lvlJc w:val="left"/>
+      <w:pPr>
+        <w:tabs>
+          <w:tab w:val="num" w:pos="5760"/>
+        </w:tabs>
+        <w:ind w:left="5760" w:hanging="360"/>
+      </w:pPr>
+      <w:rPr>
+        <w:rFonts w:ascii="Wingdings" w:hAnsi="Wingdings" w:hint="default"/>
+        <w:sz w:val="20"/>
+      </w:rPr>
+    </w:lvl>
+    <w:lvl w:ilvl="8" w:tentative="1">
+      <w:start w:val="1"/>
+      <w:numFmt w:val="bullet"/>
+      <w:lvlText w:val=""/>
+      <w:lvlJc w:val="left"/>
+      <w:pPr>
+        <w:tabs>
+          <w:tab w:val="num" w:pos="6480"/>
+        </w:tabs>
+        <w:ind w:left="6480" w:hanging="360"/>
+      </w:pPr>
+      <w:rPr>
+        <w:rFonts w:ascii="Wingdings" w:hAnsi="Wingdings" w:hint="default"/>
+        <w:sz w:val="20"/>
+      </w:rPr>
+    </w:lvl>
+  </w:abstractNum>
+  <w:abstractNum w:abstractNumId="21" w15:restartNumberingAfterBreak="0">
     <w:nsid w:val="79186CD6"/>
     <w:multiLevelType w:val="multilevel"/>
     <w:tmpl w:val="1E8E9692"/>
@@ -5480,44 +8804,223 @@
       </w:rPr>
     </w:lvl>
   </w:abstractNum>
+  <w:abstractNum w:abstractNumId="22" w15:restartNumberingAfterBreak="0">
+    <w:nsid w:val="7993503D"/>
+    <w:multiLevelType w:val="multilevel"/>
+    <w:tmpl w:val="0B029EB6"/>
+    <w:lvl w:ilvl="0">
+      <w:start w:val="1"/>
+      <w:numFmt w:val="bullet"/>
+      <w:lvlText w:val=""/>
+      <w:lvlJc w:val="left"/>
+      <w:pPr>
+        <w:tabs>
+          <w:tab w:val="num" w:pos="720"/>
+        </w:tabs>
+        <w:ind w:left="720" w:hanging="360"/>
+      </w:pPr>
+      <w:rPr>
+        <w:rFonts w:ascii="Symbol" w:hAnsi="Symbol" w:hint="default"/>
+        <w:sz w:val="20"/>
+      </w:rPr>
+    </w:lvl>
+    <w:lvl w:ilvl="1">
+      <w:start w:val="1"/>
+      <w:numFmt w:val="bullet"/>
+      <w:lvlText w:val="o"/>
+      <w:lvlJc w:val="left"/>
+      <w:pPr>
+        <w:tabs>
+          <w:tab w:val="num" w:pos="1440"/>
+        </w:tabs>
+        <w:ind w:left="1440" w:hanging="360"/>
+      </w:pPr>
+      <w:rPr>
+        <w:rFonts w:ascii="Courier New" w:hAnsi="Courier New" w:hint="default"/>
+        <w:sz w:val="20"/>
+      </w:rPr>
+    </w:lvl>
+    <w:lvl w:ilvl="2" w:tentative="1">
+      <w:start w:val="1"/>
+      <w:numFmt w:val="bullet"/>
+      <w:lvlText w:val=""/>
+      <w:lvlJc w:val="left"/>
+      <w:pPr>
+        <w:tabs>
+          <w:tab w:val="num" w:pos="2160"/>
+        </w:tabs>
+        <w:ind w:left="2160" w:hanging="360"/>
+      </w:pPr>
+      <w:rPr>
+        <w:rFonts w:ascii="Wingdings" w:hAnsi="Wingdings" w:hint="default"/>
+        <w:sz w:val="20"/>
+      </w:rPr>
+    </w:lvl>
+    <w:lvl w:ilvl="3" w:tentative="1">
+      <w:start w:val="1"/>
+      <w:numFmt w:val="bullet"/>
+      <w:lvlText w:val=""/>
+      <w:lvlJc w:val="left"/>
+      <w:pPr>
+        <w:tabs>
+          <w:tab w:val="num" w:pos="2880"/>
+        </w:tabs>
+        <w:ind w:left="2880" w:hanging="360"/>
+      </w:pPr>
+      <w:rPr>
+        <w:rFonts w:ascii="Wingdings" w:hAnsi="Wingdings" w:hint="default"/>
+        <w:sz w:val="20"/>
+      </w:rPr>
+    </w:lvl>
+    <w:lvl w:ilvl="4" w:tentative="1">
+      <w:start w:val="1"/>
+      <w:numFmt w:val="bullet"/>
+      <w:lvlText w:val=""/>
+      <w:lvlJc w:val="left"/>
+      <w:pPr>
+        <w:tabs>
+          <w:tab w:val="num" w:pos="3600"/>
+        </w:tabs>
+        <w:ind w:left="3600" w:hanging="360"/>
+      </w:pPr>
+      <w:rPr>
+        <w:rFonts w:ascii="Wingdings" w:hAnsi="Wingdings" w:hint="default"/>
+        <w:sz w:val="20"/>
+      </w:rPr>
+    </w:lvl>
+    <w:lvl w:ilvl="5" w:tentative="1">
+      <w:start w:val="1"/>
+      <w:numFmt w:val="bullet"/>
+      <w:lvlText w:val=""/>
+      <w:lvlJc w:val="left"/>
+      <w:pPr>
+        <w:tabs>
+          <w:tab w:val="num" w:pos="4320"/>
+        </w:tabs>
+        <w:ind w:left="4320" w:hanging="360"/>
+      </w:pPr>
+      <w:rPr>
+        <w:rFonts w:ascii="Wingdings" w:hAnsi="Wingdings" w:hint="default"/>
+        <w:sz w:val="20"/>
+      </w:rPr>
+    </w:lvl>
+    <w:lvl w:ilvl="6" w:tentative="1">
+      <w:start w:val="1"/>
+      <w:numFmt w:val="bullet"/>
+      <w:lvlText w:val=""/>
+      <w:lvlJc w:val="left"/>
+      <w:pPr>
+        <w:tabs>
+          <w:tab w:val="num" w:pos="5040"/>
+        </w:tabs>
+        <w:ind w:left="5040" w:hanging="360"/>
+      </w:pPr>
+      <w:rPr>
+        <w:rFonts w:ascii="Wingdings" w:hAnsi="Wingdings" w:hint="default"/>
+        <w:sz w:val="20"/>
+      </w:rPr>
+    </w:lvl>
+    <w:lvl w:ilvl="7" w:tentative="1">
+      <w:start w:val="1"/>
+      <w:numFmt w:val="bullet"/>
+      <w:lvlText w:val=""/>
+      <w:lvlJc w:val="left"/>
+      <w:pPr>
+        <w:tabs>
+          <w:tab w:val="num" w:pos="5760"/>
+        </w:tabs>
+        <w:ind w:left="5760" w:hanging="360"/>
+      </w:pPr>
+      <w:rPr>
+        <w:rFonts w:ascii="Wingdings" w:hAnsi="Wingdings" w:hint="default"/>
+        <w:sz w:val="20"/>
+      </w:rPr>
+    </w:lvl>
+    <w:lvl w:ilvl="8" w:tentative="1">
+      <w:start w:val="1"/>
+      <w:numFmt w:val="bullet"/>
+      <w:lvlText w:val=""/>
+      <w:lvlJc w:val="left"/>
+      <w:pPr>
+        <w:tabs>
+          <w:tab w:val="num" w:pos="6480"/>
+        </w:tabs>
+        <w:ind w:left="6480" w:hanging="360"/>
+      </w:pPr>
+      <w:rPr>
+        <w:rFonts w:ascii="Wingdings" w:hAnsi="Wingdings" w:hint="default"/>
+        <w:sz w:val="20"/>
+      </w:rPr>
+    </w:lvl>
+  </w:abstractNum>
   <w:num w:numId="1" w16cid:durableId="1709644027">
+    <w:abstractNumId w:val="21"/>
+  </w:num>
+  <w:num w:numId="2" w16cid:durableId="1732997872">
+    <w:abstractNumId w:val="2"/>
+  </w:num>
+  <w:num w:numId="3" w16cid:durableId="630064182">
+    <w:abstractNumId w:val="18"/>
+  </w:num>
+  <w:num w:numId="4" w16cid:durableId="310405437">
+    <w:abstractNumId w:val="15"/>
+  </w:num>
+  <w:num w:numId="5" w16cid:durableId="1102340012">
+    <w:abstractNumId w:val="4"/>
+  </w:num>
+  <w:num w:numId="6" w16cid:durableId="1782920196">
+    <w:abstractNumId w:val="1"/>
+  </w:num>
+  <w:num w:numId="7" w16cid:durableId="1340737167">
+    <w:abstractNumId w:val="16"/>
+  </w:num>
+  <w:num w:numId="8" w16cid:durableId="1780177502">
+    <w:abstractNumId w:val="5"/>
+  </w:num>
+  <w:num w:numId="9" w16cid:durableId="1264844917">
+    <w:abstractNumId w:val="7"/>
+  </w:num>
+  <w:num w:numId="10" w16cid:durableId="342442926">
+    <w:abstractNumId w:val="14"/>
+  </w:num>
+  <w:num w:numId="11" w16cid:durableId="1492211550">
+    <w:abstractNumId w:val="6"/>
+  </w:num>
+  <w:num w:numId="12" w16cid:durableId="1428115063">
+    <w:abstractNumId w:val="19"/>
+  </w:num>
+  <w:num w:numId="13" w16cid:durableId="406920110">
+    <w:abstractNumId w:val="17"/>
+  </w:num>
+  <w:num w:numId="14" w16cid:durableId="1598253177">
+    <w:abstractNumId w:val="9"/>
+  </w:num>
+  <w:num w:numId="15" w16cid:durableId="481393516">
+    <w:abstractNumId w:val="13"/>
+  </w:num>
+  <w:num w:numId="16" w16cid:durableId="47727918">
     <w:abstractNumId w:val="12"/>
   </w:num>
-  <w:num w:numId="2" w16cid:durableId="1732997872">
-    <w:abstractNumId w:val="1"/>
-  </w:num>
-  <w:num w:numId="3" w16cid:durableId="630064182">
+  <w:num w:numId="17" w16cid:durableId="265624810">
     <w:abstractNumId w:val="10"/>
   </w:num>
-  <w:num w:numId="4" w16cid:durableId="310405437">
-    <w:abstractNumId w:val="7"/>
-  </w:num>
-  <w:num w:numId="5" w16cid:durableId="1102340012">
-    <w:abstractNumId w:val="2"/>
-  </w:num>
-  <w:num w:numId="6" w16cid:durableId="1782920196">
+  <w:num w:numId="18" w16cid:durableId="81223887">
     <w:abstractNumId w:val="0"/>
   </w:num>
-  <w:num w:numId="7" w16cid:durableId="1340737167">
+  <w:num w:numId="19" w16cid:durableId="1685980387">
+    <w:abstractNumId w:val="3"/>
+  </w:num>
+  <w:num w:numId="20" w16cid:durableId="1504785490">
     <w:abstractNumId w:val="8"/>
   </w:num>
-  <w:num w:numId="8" w16cid:durableId="1780177502">
-    <w:abstractNumId w:val="3"/>
+  <w:num w:numId="21" w16cid:durableId="299918171">
+    <w:abstractNumId w:val="22"/>
   </w:num>
-  <w:num w:numId="9" w16cid:durableId="1264844917">
-    <w:abstractNumId w:val="5"/>
+  <w:num w:numId="22" w16cid:durableId="1233854897">
+    <w:abstractNumId w:val="20"/>
   </w:num>
-  <w:num w:numId="10" w16cid:durableId="342442926">
-    <w:abstractNumId w:val="6"/>
-  </w:num>
-  <w:num w:numId="11" w16cid:durableId="1492211550">
-    <w:abstractNumId w:val="4"/>
-  </w:num>
-  <w:num w:numId="12" w16cid:durableId="1428115063">
+  <w:num w:numId="23" w16cid:durableId="563179240">
     <w:abstractNumId w:val="11"/>
-  </w:num>
-  <w:num w:numId="13" w16cid:durableId="406920110">
-    <w:abstractNumId w:val="9"/>
   </w:num>
 </w:numbering>
 </file>
@@ -6449,6 +9952,50 @@
       <w:rFonts w:ascii="Times New Roman" w:hAnsi="Times New Roman" w:cs="Times New Roman"/>
     </w:rPr>
   </w:style>
+  <w:style w:type="paragraph" w:styleId="Header">
+    <w:name w:val="header"/>
+    <w:basedOn w:val="Normal"/>
+    <w:link w:val="HeaderChar"/>
+    <w:uiPriority w:val="99"/>
+    <w:unhideWhenUsed/>
+    <w:rsid w:val="00DB432A"/>
+    <w:pPr>
+      <w:tabs>
+        <w:tab w:val="center" w:pos="4513"/>
+        <w:tab w:val="right" w:pos="9026"/>
+      </w:tabs>
+      <w:spacing w:after="0" w:line="240" w:lineRule="auto"/>
+    </w:pPr>
+  </w:style>
+  <w:style w:type="character" w:customStyle="1" w:styleId="HeaderChar">
+    <w:name w:val="Header Char"/>
+    <w:basedOn w:val="DefaultParagraphFont"/>
+    <w:link w:val="Header"/>
+    <w:uiPriority w:val="99"/>
+    <w:rsid w:val="00DB432A"/>
+  </w:style>
+  <w:style w:type="paragraph" w:styleId="Footer">
+    <w:name w:val="footer"/>
+    <w:basedOn w:val="Normal"/>
+    <w:link w:val="FooterChar"/>
+    <w:uiPriority w:val="99"/>
+    <w:unhideWhenUsed/>
+    <w:rsid w:val="00DB432A"/>
+    <w:pPr>
+      <w:tabs>
+        <w:tab w:val="center" w:pos="4513"/>
+        <w:tab w:val="right" w:pos="9026"/>
+      </w:tabs>
+      <w:spacing w:after="0" w:line="240" w:lineRule="auto"/>
+    </w:pPr>
+  </w:style>
+  <w:style w:type="character" w:customStyle="1" w:styleId="FooterChar">
+    <w:name w:val="Footer Char"/>
+    <w:basedOn w:val="DefaultParagraphFont"/>
+    <w:link w:val="Footer"/>
+    <w:uiPriority w:val="99"/>
+    <w:rsid w:val="00DB432A"/>
+  </w:style>
 </w:styles>
 </file>
 

</xml_diff>